<commit_message>
Update review tools and research data
</commit_message>
<xml_diff>
--- a/intro Website/outline.docx
+++ b/intro Website/outline.docx
@@ -176,7 +176,19 @@
         <w:rPr>
           <w:rFonts w:hint="eastAsia"/>
         </w:rPr>
-        <w:t>員親自撰寫，密封後直接送到御前，由皇帝親自閱覽和硃批。雍正朝設立軍機處後，皇帝批閱</w:t>
+        <w:t>員親自撰寫，密封後直接送到御前，由皇帝親自閱覽和硃批。</w:t>
+      </w:r>
+      <w:r>
+        <w:rPr>
+          <w:rFonts w:hint="eastAsia"/>
+        </w:rPr>
+        <w:t>在</w:t>
+      </w:r>
+      <w:r>
+        <w:rPr>
+          <w:rFonts w:hint="eastAsia"/>
+        </w:rPr>
+        <w:t>雍正朝設立軍機處後，皇帝批閱</w:t>
       </w:r>
       <w:r>
         <w:rPr>
@@ -229,65 +241,272 @@
     </w:p>
     <w:p/>
     <w:p>
-      <w:pPr>
-        <w:rPr>
-          <w:rFonts w:hint="eastAsia"/>
-        </w:rPr>
-      </w:pPr>
-      <w:r>
-        <w:rPr>
-          <w:rFonts w:hint="eastAsia"/>
-        </w:rPr>
-        <w:t>相較於題本，奏折減少了中間轉遞和內閣票擬的程序，有利於皇帝直接掌握地方和前線資訊。</w:t>
+      <w:r>
+        <w:rPr>
+          <w:rFonts w:hint="eastAsia"/>
+        </w:rPr>
+        <w:t>奏折是清代最重要的官方文書制度之一。在政治史方面，學界普遍認為，奏折制度減少了內閣票擬等中間程序，使皇帝能夠更直接地與地方官員通信、掌握地方政務，從而強化清代的中央集權。（秦國經，《明清檔案學》，北京：學苑出版社，</w:t>
+      </w:r>
+      <w:r>
+        <w:rPr>
+          <w:rFonts w:hint="eastAsia"/>
+        </w:rPr>
+        <w:t>2005</w:t>
+      </w:r>
+      <w:r>
+        <w:rPr>
+          <w:rFonts w:hint="eastAsia"/>
+        </w:rPr>
+        <w:t>年，頁碼待核；王劍，〈近</w:t>
+      </w:r>
+      <w:r>
+        <w:rPr>
+          <w:rFonts w:hint="eastAsia"/>
+        </w:rPr>
+        <w:t>50</w:t>
+      </w:r>
+      <w:r>
+        <w:rPr>
+          <w:rFonts w:hint="eastAsia"/>
+        </w:rPr>
+        <w:t>年來清代奏折制度研究綜述〉，《中國史研究動態》，</w:t>
+      </w:r>
+      <w:r>
+        <w:rPr>
+          <w:rFonts w:hint="eastAsia"/>
+        </w:rPr>
+        <w:t>2004</w:t>
+      </w:r>
+      <w:r>
+        <w:rPr>
+          <w:rFonts w:hint="eastAsia"/>
+        </w:rPr>
+        <w:t>年第</w:t>
+      </w:r>
+      <w:r>
+        <w:rPr>
+          <w:rFonts w:hint="eastAsia"/>
+        </w:rPr>
+        <w:t>7</w:t>
+      </w:r>
+      <w:r>
+        <w:rPr>
+          <w:rFonts w:hint="eastAsia"/>
+        </w:rPr>
+        <w:t>期，頁</w:t>
+      </w:r>
+      <w:r>
+        <w:rPr>
+          <w:rFonts w:hint="eastAsia"/>
+        </w:rPr>
+        <w:t>20</w:t>
+      </w:r>
+      <w:r>
+        <w:rPr>
+          <w:rFonts w:hint="eastAsia"/>
+        </w:rPr>
+        <w:t>–</w:t>
+      </w:r>
+      <w:r>
+        <w:rPr>
+          <w:rFonts w:hint="eastAsia"/>
+        </w:rPr>
+        <w:t>21</w:t>
+      </w:r>
+      <w:r>
+        <w:rPr>
+          <w:rFonts w:hint="eastAsia"/>
+        </w:rPr>
+        <w:t>。）</w:t>
       </w:r>
     </w:p>
     <w:p/>
     <w:p>
-      <w:pPr>
-        <w:rPr>
-          <w:rFonts w:hint="eastAsia"/>
-        </w:rPr>
-      </w:pPr>
-    </w:p>
-    <w:p>
-      <w:pPr>
-        <w:rPr>
-          <w:rFonts w:hint="eastAsia"/>
-        </w:rPr>
-      </w:pPr>
-      <w:r>
-        <w:rPr>
-          <w:rFonts w:hint="eastAsia"/>
-        </w:rPr>
-        <w:t>月</w:t>
+      <w:r>
+        <w:rPr>
+          <w:rFonts w:hint="eastAsia"/>
+        </w:rPr>
+        <w:t>而在</w:t>
+      </w:r>
+      <w:r>
+        <w:rPr>
+          <w:rFonts w:hint="eastAsia"/>
+        </w:rPr>
+        <w:t>歷史學研究中，奏折亦是研究清</w:t>
+      </w:r>
+      <w:r>
+        <w:rPr>
+          <w:rFonts w:hint="eastAsia"/>
+        </w:rPr>
+        <w:t>代的</w:t>
+      </w:r>
+      <w:r>
+        <w:rPr>
+          <w:rFonts w:hint="eastAsia"/>
+        </w:rPr>
+        <w:t>重要一手</w:t>
+      </w:r>
+      <w:r>
+        <w:rPr>
+          <w:rFonts w:hint="eastAsia"/>
+        </w:rPr>
+        <w:t>材</w:t>
+      </w:r>
+      <w:r>
+        <w:rPr>
+          <w:rFonts w:hint="eastAsia"/>
+        </w:rPr>
+        <w:t>料。奏折</w:t>
+      </w:r>
+      <w:r>
+        <w:rPr>
+          <w:rFonts w:hint="eastAsia"/>
+        </w:rPr>
+        <w:t>、硃批和上諭是</w:t>
+      </w:r>
+      <w:r>
+        <w:rPr>
+          <w:rFonts w:hint="eastAsia"/>
+        </w:rPr>
+        <w:t>中央與地方在政治決策過程中的原始通信記錄</w:t>
+      </w:r>
+      <w:r>
+        <w:rPr>
+          <w:rFonts w:hint="eastAsia"/>
+        </w:rPr>
+        <w:t>。透過這些文書，學者能夠重構地方資訊是</w:t>
+      </w:r>
+      <w:r>
+        <w:rPr>
+          <w:rFonts w:hint="eastAsia"/>
+        </w:rPr>
+        <w:t>如何</w:t>
+      </w:r>
+      <w:r>
+        <w:rPr>
+          <w:rFonts w:hint="eastAsia"/>
+        </w:rPr>
+        <w:t>由奏折</w:t>
+      </w:r>
+      <w:r>
+        <w:rPr>
+          <w:rFonts w:hint="eastAsia"/>
+        </w:rPr>
+        <w:t>傳到中央</w:t>
+      </w:r>
+      <w:r>
+        <w:rPr>
+          <w:rFonts w:hint="eastAsia"/>
+        </w:rPr>
+        <w:t>，皇帝的</w:t>
+      </w:r>
+      <w:r>
+        <w:rPr>
+          <w:rFonts w:hint="eastAsia"/>
+        </w:rPr>
+        <w:t>命令</w:t>
+      </w:r>
+      <w:r>
+        <w:rPr>
+          <w:rFonts w:hint="eastAsia"/>
+        </w:rPr>
+        <w:t>又如何在硃批和上諭中</w:t>
+      </w:r>
+      <w:r>
+        <w:rPr>
+          <w:rFonts w:hint="eastAsia"/>
+        </w:rPr>
+        <w:t>形成，以及</w:t>
+      </w:r>
+      <w:r>
+        <w:rPr>
+          <w:rFonts w:hint="eastAsia"/>
+        </w:rPr>
+        <w:t>在後續奏報中，</w:t>
+      </w:r>
+      <w:r>
+        <w:rPr>
+          <w:rFonts w:hint="eastAsia"/>
+        </w:rPr>
+        <w:t>地方官員如何執行</w:t>
+      </w:r>
+      <w:r>
+        <w:rPr>
+          <w:rFonts w:hint="eastAsia"/>
+        </w:rPr>
+        <w:t>皇帝的</w:t>
+      </w:r>
+      <w:r>
+        <w:rPr>
+          <w:rFonts w:hint="eastAsia"/>
+        </w:rPr>
+        <w:t>命令。</w:t>
       </w:r>
     </w:p>
     <w:p/>
     <w:p>
-      <w:pPr>
-        <w:rPr>
-          <w:rFonts w:hint="eastAsia"/>
-        </w:rPr>
-      </w:pPr>
-      <w:r>
-        <w:rPr>
-          <w:rFonts w:hint="eastAsia"/>
-        </w:rPr>
-        <w:t>奏折制度的重要性在於，它讓皇帝可以更直接掌握地方和前線資訊，減少內閣票擬等中間程序，並透過硃批、上諭和回奏直接控制政務。因此，奏折制度是清代皇權集中、軍機處運作和中央地方通信的重要制度基礎。</w:t>
+      <w:r>
+        <w:rPr>
+          <w:rFonts w:hint="eastAsia"/>
+        </w:rPr>
+        <w:t>正如學者指出，奏折與上諭亦是清代其他重要文獻的基礎材料。例如，《方略》正是在重大戰爭結束後，由清廷搜集、整理相關檔案，按照時間順序編排，並經過刪節與潤飾而成的文獻。然而，其中收錄的文書經過官方選擇、刪減和詮釋，</w:t>
+      </w:r>
+      <w:r>
+        <w:rPr>
+          <w:rFonts w:hint="eastAsia"/>
+        </w:rPr>
+        <w:t>原始性不及</w:t>
+      </w:r>
+      <w:r>
+        <w:rPr>
+          <w:rFonts w:hint="eastAsia"/>
+        </w:rPr>
+        <w:t>檔案</w:t>
+      </w:r>
+      <w:r>
+        <w:rPr>
+          <w:rFonts w:hint="eastAsia"/>
+        </w:rPr>
+        <w:t>，</w:t>
+      </w:r>
+      <w:r>
+        <w:rPr>
+          <w:rFonts w:hint="eastAsia"/>
+        </w:rPr>
+        <w:t>這正顯示了奏折的重要</w:t>
+      </w:r>
+      <w:r>
+        <w:rPr>
+          <w:rFonts w:hint="eastAsia"/>
+        </w:rPr>
+        <w:t>研究</w:t>
+      </w:r>
+      <w:r>
+        <w:rPr>
+          <w:rFonts w:hint="eastAsia"/>
+        </w:rPr>
+        <w:t>價值。</w:t>
       </w:r>
     </w:p>
     <w:p/>
     <w:p>
-      <w:pPr>
-        <w:rPr>
-          <w:rFonts w:hint="eastAsia"/>
-        </w:rPr>
-      </w:pPr>
-      <w:r>
-        <w:rPr>
-          <w:rFonts w:hint="eastAsia"/>
-        </w:rPr>
-        <w:t>不過，奏折制度並不等於每一份奏折都必然有硃批或上諭。不同文書的處理方式可能不同，研究者需要根據原文、日期和檔案記錄重建具體流程。</w:t>
+      <w:r>
+        <w:rPr>
+          <w:rFonts w:hint="eastAsia"/>
+        </w:rPr>
+        <w:t>然而，研究</w:t>
+      </w:r>
+      <w:r>
+        <w:rPr>
+          <w:rFonts w:hint="eastAsia"/>
+        </w:rPr>
+        <w:t>奏折與上諭</w:t>
+      </w:r>
+      <w:r>
+        <w:rPr>
+          <w:rFonts w:hint="eastAsia"/>
+        </w:rPr>
+        <w:t>的難度不少。</w:t>
       </w:r>
     </w:p>
     <w:p/>
@@ -296,194 +515,836 @@
         <w:rPr>
           <w:rFonts w:hint="eastAsia"/>
         </w:rPr>
-        <w:t>（秦國經，《明清檔案學》，北京：學苑出版社，</w:t>
-      </w:r>
-      <w:r>
-        <w:rPr>
-          <w:rFonts w:hint="eastAsia"/>
-        </w:rPr>
-        <w:t>2005</w:t>
-      </w:r>
-      <w:r>
-        <w:rPr>
-          <w:rFonts w:hint="eastAsia"/>
-        </w:rPr>
-        <w:t>年，頁碼待核；王劍，〈近</w:t>
-      </w:r>
-      <w:r>
-        <w:rPr>
-          <w:rFonts w:hint="eastAsia"/>
-        </w:rPr>
-        <w:t>50</w:t>
-      </w:r>
-      <w:r>
-        <w:rPr>
-          <w:rFonts w:hint="eastAsia"/>
-        </w:rPr>
-        <w:t>年來清代奏折制度研究綜述〉，《中國史研究動態》，</w:t>
-      </w:r>
-      <w:r>
-        <w:rPr>
-          <w:rFonts w:hint="eastAsia"/>
-        </w:rPr>
-        <w:t>2004</w:t>
-      </w:r>
-      <w:r>
-        <w:rPr>
-          <w:rFonts w:hint="eastAsia"/>
-        </w:rPr>
-        <w:t>年第</w:t>
-      </w:r>
-      <w:r>
-        <w:rPr>
-          <w:rFonts w:hint="eastAsia"/>
-        </w:rPr>
-        <w:t>7</w:t>
-      </w:r>
-      <w:r>
-        <w:rPr>
-          <w:rFonts w:hint="eastAsia"/>
-        </w:rPr>
-        <w:t>期，頁</w:t>
-      </w:r>
-      <w:r>
-        <w:rPr>
-          <w:rFonts w:hint="eastAsia"/>
-        </w:rPr>
-        <w:t>20</w:t>
-      </w:r>
-      <w:r>
-        <w:rPr>
-          <w:rFonts w:hint="eastAsia"/>
-        </w:rPr>
-        <w:t>–</w:t>
-      </w:r>
-      <w:r>
-        <w:rPr>
-          <w:rFonts w:hint="eastAsia"/>
-        </w:rPr>
-        <w:t>21</w:t>
-      </w:r>
-      <w:r>
-        <w:rPr>
-          <w:rFonts w:hint="eastAsia"/>
-        </w:rPr>
-        <w:t>。）</w:t>
+        <w:t>首先，奏折和上諭的數量十分龐大。正如戴英從指出，研究白蓮教戰爭的重要材料《欽定剿平三省邪匪方略》共有六十九冊，超過二萬七千頁，</w:t>
+      </w:r>
+      <w:r>
+        <w:rPr>
+          <w:rFonts w:hint="eastAsia"/>
+        </w:rPr>
+        <w:t>收錄了共四千多份</w:t>
+      </w:r>
+      <w:r>
+        <w:rPr>
+          <w:rFonts w:hint="eastAsia"/>
+        </w:rPr>
+        <w:t>奏摺</w:t>
+      </w:r>
+      <w:r>
+        <w:rPr>
+          <w:rFonts w:hint="eastAsia"/>
+        </w:rPr>
+        <w:t>和</w:t>
+      </w:r>
+      <w:r>
+        <w:rPr>
+          <w:rFonts w:hint="eastAsia"/>
+        </w:rPr>
+        <w:t>上諭，篇幅極為龐大，</w:t>
+      </w:r>
+      <w:r>
+        <w:rPr>
+          <w:rFonts w:hint="eastAsia"/>
+        </w:rPr>
+        <w:t>令人望而卻步，</w:t>
+      </w:r>
+      <w:r>
+        <w:rPr>
+          <w:rFonts w:hint="eastAsia"/>
+        </w:rPr>
+        <w:t>當代學者對白蓮教戰爭的</w:t>
+      </w:r>
+      <w:r>
+        <w:rPr>
+          <w:rFonts w:hint="eastAsia"/>
+        </w:rPr>
+        <w:t>研究</w:t>
+      </w:r>
+      <w:r>
+        <w:rPr>
+          <w:rFonts w:hint="eastAsia"/>
+        </w:rPr>
+        <w:t>因此相</w:t>
+      </w:r>
+      <w:r>
+        <w:rPr>
+          <w:rFonts w:hint="eastAsia"/>
+        </w:rPr>
+        <w:t>當</w:t>
+      </w:r>
+      <w:r>
+        <w:rPr>
+          <w:rFonts w:hint="eastAsia"/>
+        </w:rPr>
+        <w:t>有限</w:t>
+      </w:r>
+      <w:r>
+        <w:rPr>
+          <w:rFonts w:hint="eastAsia"/>
+        </w:rPr>
+        <w:t>。可見，</w:t>
+      </w:r>
+      <w:r>
+        <w:rPr>
+          <w:rFonts w:hint="eastAsia"/>
+        </w:rPr>
+        <w:t>原始史料</w:t>
+      </w:r>
+      <w:r>
+        <w:rPr>
+          <w:rFonts w:hint="eastAsia"/>
+        </w:rPr>
+        <w:t>的</w:t>
+      </w:r>
+      <w:r>
+        <w:rPr>
+          <w:rFonts w:hint="eastAsia"/>
+        </w:rPr>
+        <w:t>數量龐大</w:t>
+      </w:r>
+      <w:r>
+        <w:rPr>
+          <w:rFonts w:hint="eastAsia"/>
+        </w:rPr>
+        <w:t>，</w:t>
+      </w:r>
+      <w:r>
+        <w:rPr>
+          <w:rFonts w:hint="eastAsia"/>
+        </w:rPr>
+        <w:t>增加了</w:t>
+      </w:r>
+      <w:r>
+        <w:rPr>
+          <w:rFonts w:hint="eastAsia"/>
+        </w:rPr>
+        <w:t>學</w:t>
+      </w:r>
+      <w:r>
+        <w:rPr>
+          <w:rFonts w:hint="eastAsia"/>
+        </w:rPr>
+        <w:t>者閱讀材料的難度</w:t>
+      </w:r>
+      <w:r>
+        <w:rPr>
+          <w:rFonts w:hint="eastAsia"/>
+        </w:rPr>
+        <w:t>，降低了研究的意願</w:t>
+      </w:r>
+      <w:r>
+        <w:rPr>
+          <w:rFonts w:hint="eastAsia"/>
+        </w:rPr>
+        <w:t>。</w:t>
+      </w:r>
+      <w:r>
+        <w:rPr>
+          <w:rFonts w:hint="eastAsia"/>
+        </w:rPr>
+        <w:lastRenderedPageBreak/>
+        <w:t>（戴英從，《</w:t>
+      </w:r>
+      <w:r>
+        <w:rPr>
+          <w:rFonts w:hint="eastAsia"/>
+        </w:rPr>
+        <w:t>The White Lotus War: Rebellion and Suppression in Late Imperial China</w:t>
+      </w:r>
+      <w:r>
+        <w:rPr>
+          <w:rFonts w:hint="eastAsia"/>
+        </w:rPr>
+        <w:t>》，</w:t>
+      </w:r>
+      <w:r>
+        <w:rPr>
+          <w:rFonts w:hint="eastAsia"/>
+        </w:rPr>
+        <w:t>2019</w:t>
+      </w:r>
+      <w:r>
+        <w:rPr>
+          <w:rFonts w:hint="eastAsia"/>
+        </w:rPr>
+        <w:t>年，第一章，頁碼待核。）</w:t>
       </w:r>
     </w:p>
     <w:p/>
     <w:p>
-      <w:pPr>
-        <w:rPr>
-          <w:rFonts w:hint="eastAsia"/>
-        </w:rPr>
-      </w:pPr>
-      <w:r>
-        <w:rPr>
-          <w:rFonts w:hint="eastAsia"/>
-        </w:rPr>
-        <w:t>清代皇帝與官員之間的通信，不是由一種固定文件完成的。奏折是官員向皇帝呈報的上行文書；硃批是皇帝在奏折上作出的硃筆批答；上諭則是皇帝向臣下發布的指示或諭旨。</w:t>
+      <w:r>
+        <w:rPr>
+          <w:rFonts w:hint="eastAsia"/>
+        </w:rPr>
+        <w:t>另外，奏折涉及複雜的</w:t>
+      </w:r>
+      <w:r>
+        <w:rPr>
+          <w:rFonts w:hint="eastAsia"/>
+        </w:rPr>
+        <w:t>通信關係</w:t>
+      </w:r>
+      <w:r>
+        <w:rPr>
+          <w:rFonts w:hint="eastAsia"/>
+        </w:rPr>
+        <w:t>。當中最表面的一層，是地方官員奏報，皇帝再透過硃批或上諭作出回覆。然而，研究者不只需要留意官員何時發出奏折、皇帝何時批閱，也要注意該次奏折是否是在回覆先前的硃批或上諭；同時，還要追蹤皇帝這次發布的上諭，何時才在後續奏折中得到回應。此外，</w:t>
+      </w:r>
+      <w:r>
+        <w:rPr>
+          <w:rFonts w:hint="eastAsia"/>
+        </w:rPr>
+        <w:t>在研究特定議題的奏折時，如戰爭</w:t>
+      </w:r>
+      <w:r>
+        <w:rPr>
+          <w:rFonts w:hint="eastAsia"/>
+        </w:rPr>
+        <w:t>和</w:t>
+      </w:r>
+      <w:r>
+        <w:rPr>
+          <w:rFonts w:hint="eastAsia"/>
+        </w:rPr>
+        <w:t>司法</w:t>
+      </w:r>
+      <w:r>
+        <w:rPr>
+          <w:rFonts w:hint="eastAsia"/>
+        </w:rPr>
+        <w:t>，</w:t>
+      </w:r>
+      <w:r>
+        <w:rPr>
+          <w:rFonts w:hint="eastAsia"/>
+        </w:rPr>
+        <w:t>研究者亦要考察官員在奏折中上報了哪些消息、事件在何時發生，以及消息</w:t>
+      </w:r>
+      <w:r>
+        <w:rPr>
+          <w:rFonts w:hint="eastAsia"/>
+        </w:rPr>
+        <w:t>的來源</w:t>
+      </w:r>
+      <w:r>
+        <w:rPr>
+          <w:rFonts w:hint="eastAsia"/>
+        </w:rPr>
+        <w:t>。皇帝</w:t>
+      </w:r>
+      <w:r>
+        <w:rPr>
+          <w:rFonts w:hint="eastAsia"/>
+        </w:rPr>
+        <w:t>亦</w:t>
+      </w:r>
+      <w:r>
+        <w:rPr>
+          <w:rFonts w:hint="eastAsia"/>
+        </w:rPr>
+        <w:t>可能同時收到關於同一事件的多份奏報，而各奏報的收發時間、具體描述和消息來源亦有所不同。</w:t>
+      </w:r>
+      <w:r>
+        <w:rPr>
+          <w:rFonts w:hint="eastAsia"/>
+        </w:rPr>
+        <w:t>由此可見，奏折與上諭之間形成了不斷往返、彼此連接的多層次通信網絡。因此，研究者不但要從微觀角度分析文書中的個別訊息，也要從宏觀角度建構和理解訊息往來網絡。研究</w:t>
+      </w:r>
+      <w:r>
+        <w:rPr>
+          <w:rFonts w:hint="eastAsia"/>
+        </w:rPr>
+        <w:t>因此不能只停留於</w:t>
+      </w:r>
+      <w:r>
+        <w:rPr>
+          <w:rFonts w:hint="eastAsia"/>
+        </w:rPr>
+        <w:t>按順序閱讀純文字材料</w:t>
+      </w:r>
+      <w:r>
+        <w:rPr>
+          <w:rFonts w:hint="eastAsia"/>
+        </w:rPr>
+        <w:t>，也</w:t>
+      </w:r>
+      <w:r>
+        <w:rPr>
+          <w:rFonts w:hint="eastAsia"/>
+        </w:rPr>
+        <w:t>要借助視覺化</w:t>
+      </w:r>
+      <w:r>
+        <w:rPr>
+          <w:rFonts w:hint="eastAsia"/>
+        </w:rPr>
+        <w:t>的</w:t>
+      </w:r>
+      <w:r>
+        <w:rPr>
+          <w:rFonts w:hint="eastAsia"/>
+        </w:rPr>
+        <w:t>工具。</w:t>
+      </w:r>
+    </w:p>
+    <w:p>
+      <w:r>
+        <w:br w:type="page"/>
       </w:r>
     </w:p>
     <w:p/>
     <w:p>
-      <w:pPr>
-        <w:rPr>
-          <w:rFonts w:hint="eastAsia"/>
-        </w:rPr>
-      </w:pPr>
+      <w:r>
+        <w:rPr>
+          <w:rFonts w:hint="eastAsia"/>
+        </w:rPr>
+        <w:t>龐大的文本數量和複雜的通信關係，是研究奏折與上諭的兩大困難。筆者認為，人工智能</w:t>
+      </w:r>
+      <w:r>
+        <w:rPr>
+          <w:rFonts w:hint="eastAsia"/>
+        </w:rPr>
+        <w:t>（</w:t>
+      </w:r>
+      <w:r>
+        <w:rPr>
+          <w:rFonts w:hint="eastAsia"/>
+        </w:rPr>
+        <w:t>AI</w:t>
+      </w:r>
+      <w:r>
+        <w:rPr>
+          <w:rFonts w:hint="eastAsia"/>
+        </w:rPr>
+        <w:t>）</w:t>
+      </w:r>
+      <w:r>
+        <w:rPr>
+          <w:rFonts w:hint="eastAsia"/>
+        </w:rPr>
+        <w:t>與視覺化的數位工具，能夠協助研究者處理上述</w:t>
+      </w:r>
+      <w:r>
+        <w:rPr>
+          <w:rFonts w:hint="eastAsia"/>
+        </w:rPr>
+        <w:t>難</w:t>
+      </w:r>
+      <w:r>
+        <w:rPr>
+          <w:rFonts w:hint="eastAsia"/>
+        </w:rPr>
+        <w:t>題</w:t>
+      </w:r>
+      <w:r>
+        <w:rPr>
+          <w:rFonts w:hint="eastAsia"/>
+        </w:rPr>
+        <w:t>，包括：</w:t>
+      </w:r>
+    </w:p>
+    <w:p/>
+    <w:p>
+      <w:pPr>
+        <w:rPr>
+          <w:rFonts w:hint="eastAsia"/>
+        </w:rPr>
+      </w:pPr>
+      <w:r>
+        <w:rPr>
+          <w:rFonts w:hint="eastAsia"/>
+        </w:rPr>
+        <w:t xml:space="preserve">1. </w:t>
+      </w:r>
+      <w:r>
+        <w:rPr>
+          <w:rFonts w:hint="eastAsia"/>
+        </w:rPr>
+        <w:t>利用</w:t>
+      </w:r>
+      <w:r>
+        <w:rPr>
+          <w:rFonts w:hint="eastAsia"/>
+        </w:rPr>
+        <w:t xml:space="preserve"> Python </w:t>
+      </w:r>
+      <w:r>
+        <w:rPr>
+          <w:rFonts w:hint="eastAsia"/>
+        </w:rPr>
+        <w:t>搜尋文本中的特定字眼，重建官員與皇帝之間的通信脈絡及資訊傳遞過程。</w:t>
+      </w:r>
+    </w:p>
+    <w:p>
+      <w:r>
+        <w:rPr>
+          <w:rFonts w:hint="eastAsia"/>
+        </w:rPr>
+        <w:t xml:space="preserve">2. </w:t>
+      </w:r>
+      <w:r>
+        <w:rPr>
+          <w:rFonts w:hint="eastAsia"/>
+        </w:rPr>
+        <w:t>利用</w:t>
+      </w:r>
+      <w:r>
+        <w:rPr>
+          <w:rFonts w:hint="eastAsia"/>
+        </w:rPr>
+        <w:t>AI</w:t>
+      </w:r>
+      <w:r>
+        <w:rPr>
+          <w:rFonts w:hint="eastAsia"/>
+        </w:rPr>
+        <w:t>總結</w:t>
+      </w:r>
+      <w:r>
+        <w:rPr>
+          <w:rFonts w:hint="eastAsia"/>
+        </w:rPr>
+        <w:t>長篇</w:t>
+      </w:r>
+      <w:r>
+        <w:rPr>
+          <w:rFonts w:hint="eastAsia"/>
+        </w:rPr>
+        <w:t>文本</w:t>
+      </w:r>
+      <w:r>
+        <w:rPr>
+          <w:rFonts w:hint="eastAsia"/>
+        </w:rPr>
+        <w:t>，</w:t>
+      </w:r>
+      <w:r>
+        <w:rPr>
+          <w:rFonts w:hint="eastAsia"/>
+        </w:rPr>
+        <w:t xml:space="preserve">    </w:t>
+      </w:r>
+      <w:r>
+        <w:rPr>
+          <w:rFonts w:hint="eastAsia"/>
+        </w:rPr>
+        <w:t>讓研究者迅速掌握文</w:t>
+      </w:r>
+      <w:r>
+        <w:rPr>
+          <w:rFonts w:hint="eastAsia"/>
+        </w:rPr>
+        <w:t>本</w:t>
+      </w:r>
+      <w:r>
+        <w:rPr>
+          <w:rFonts w:hint="eastAsia"/>
+        </w:rPr>
+        <w:t>內容，並初步判斷其中是否包含值得深入閱讀與分析的資訊。</w:t>
+      </w:r>
+    </w:p>
+    <w:p>
+      <w:pPr>
+        <w:rPr>
+          <w:rFonts w:hint="eastAsia"/>
+        </w:rPr>
+      </w:pPr>
+      <w:r>
+        <w:rPr>
+          <w:rFonts w:hint="eastAsia"/>
+        </w:rPr>
+        <w:t xml:space="preserve">3. </w:t>
+      </w:r>
+      <w:r>
+        <w:rPr>
+          <w:rFonts w:hint="eastAsia"/>
+        </w:rPr>
+        <w:t>為</w:t>
+      </w:r>
+      <w:r>
+        <w:rPr>
+          <w:rFonts w:hint="eastAsia"/>
+        </w:rPr>
+        <w:t>不同研究問題</w:t>
+      </w:r>
+      <w:r>
+        <w:rPr>
+          <w:rFonts w:hint="eastAsia"/>
+        </w:rPr>
+        <w:t>設計</w:t>
+      </w:r>
+      <w:r>
+        <w:rPr>
+          <w:rFonts w:hint="eastAsia"/>
+        </w:rPr>
+        <w:t>相應</w:t>
+      </w:r>
+      <w:r>
+        <w:rPr>
+          <w:rFonts w:hint="eastAsia"/>
+        </w:rPr>
+        <w:t>的人工智能技能（</w:t>
+      </w:r>
+      <w:r>
+        <w:rPr>
+          <w:rFonts w:hint="eastAsia"/>
+        </w:rPr>
+        <w:t>AI Skills</w:t>
+      </w:r>
+      <w:r>
+        <w:rPr>
+          <w:rFonts w:hint="eastAsia"/>
+        </w:rPr>
+        <w:t>），讓</w:t>
+      </w:r>
+      <w:r>
+        <w:rPr>
+          <w:rFonts w:hint="eastAsia"/>
+        </w:rPr>
+        <w:t>AI</w:t>
+      </w:r>
+      <w:r>
+        <w:rPr>
+          <w:rFonts w:hint="eastAsia"/>
+        </w:rPr>
+        <w:t>從文本中</w:t>
+      </w:r>
+      <w:r>
+        <w:rPr>
+          <w:rFonts w:hint="eastAsia"/>
+        </w:rPr>
+        <w:t>提取</w:t>
+      </w:r>
+      <w:r>
+        <w:rPr>
+          <w:rFonts w:hint="eastAsia"/>
+        </w:rPr>
+        <w:t>特定資訊</w:t>
+      </w:r>
+      <w:r>
+        <w:rPr>
+          <w:rFonts w:hint="eastAsia"/>
+        </w:rPr>
+        <w:t>，</w:t>
+      </w:r>
+      <w:r>
+        <w:rPr>
+          <w:rFonts w:hint="eastAsia"/>
+        </w:rPr>
+        <w:t>再交由研究者核對、審核及修正。</w:t>
+      </w:r>
+    </w:p>
+    <w:p>
+      <w:r>
+        <w:rPr>
+          <w:rFonts w:hint="eastAsia"/>
+        </w:rPr>
+        <w:t xml:space="preserve">4. </w:t>
+      </w:r>
+      <w:r>
+        <w:rPr>
+          <w:rFonts w:hint="eastAsia"/>
+        </w:rPr>
+        <w:t>建立</w:t>
+      </w:r>
+      <w:r>
+        <w:rPr>
+          <w:rFonts w:hint="eastAsia"/>
+        </w:rPr>
+        <w:t>互動式網站，以時間線和關係網絡等視覺化方式呈現資訊傳遞過程，協助研究者從宏觀角度理解通信脈絡。</w:t>
+      </w:r>
+    </w:p>
+    <w:p>
+      <w:pPr>
+        <w:rPr>
+          <w:rFonts w:hint="eastAsia"/>
+        </w:rPr>
+      </w:pPr>
+    </w:p>
+    <w:p>
+      <w:pPr>
+        <w:rPr>
+          <w:lang w:val="en-US"/>
+        </w:rPr>
+      </w:pPr>
+    </w:p>
+    <w:p/>
+    <w:p>
+      <w:r>
+        <w:br w:type="page"/>
+      </w:r>
+    </w:p>
+    <w:p>
       <w:r>
         <w:rPr>
           <w:rFonts w:hint="eastAsia"/>
         </w:rPr>
         <w:lastRenderedPageBreak/>
-        <w:t>奏折是清代重要的上行官方文書。雍正朝以後，重要或機密的軍政、公務逐漸大量透過奏折上報，成為研究地方官員如何組織消息、提出請求和回應中央要求的重要史料。（王劍，〈近</w:t>
-      </w:r>
-      <w:r>
-        <w:rPr>
-          <w:rFonts w:hint="eastAsia"/>
-        </w:rPr>
-        <w:t>50</w:t>
-      </w:r>
-      <w:r>
-        <w:rPr>
-          <w:rFonts w:hint="eastAsia"/>
-        </w:rPr>
-        <w:t>年來清代奏折制度研究綜述〉，《中國史研究動態》，</w:t>
-      </w:r>
-      <w:r>
-        <w:rPr>
-          <w:rFonts w:hint="eastAsia"/>
-        </w:rPr>
-        <w:t>2004</w:t>
-      </w:r>
-      <w:r>
-        <w:rPr>
-          <w:rFonts w:hint="eastAsia"/>
-        </w:rPr>
-        <w:t>年第</w:t>
-      </w:r>
-      <w:r>
-        <w:rPr>
-          <w:rFonts w:hint="eastAsia"/>
-        </w:rPr>
-        <w:t>7</w:t>
-      </w:r>
-      <w:r>
-        <w:rPr>
-          <w:rFonts w:hint="eastAsia"/>
-        </w:rPr>
-        <w:t>期，頁</w:t>
-      </w:r>
-      <w:r>
-        <w:rPr>
-          <w:rFonts w:hint="eastAsia"/>
-        </w:rPr>
-        <w:t>20</w:t>
-      </w:r>
-      <w:r>
-        <w:rPr>
-          <w:rFonts w:hint="eastAsia"/>
-        </w:rPr>
-        <w:t>–</w:t>
-      </w:r>
-      <w:r>
-        <w:rPr>
-          <w:rFonts w:hint="eastAsia"/>
-        </w:rPr>
-        <w:t>21</w:t>
-      </w:r>
-      <w:r>
-        <w:rPr>
-          <w:rFonts w:hint="eastAsia"/>
-        </w:rPr>
-        <w:t>。）</w:t>
+        <w:t>龐大的文本數量和複雜的通信關係，是研究奏折與上諭的兩大困難。筆者認為，人工智能</w:t>
+      </w:r>
+      <w:r>
+        <w:rPr>
+          <w:rFonts w:hint="eastAsia"/>
+        </w:rPr>
+        <w:t>（</w:t>
+      </w:r>
+      <w:r>
+        <w:rPr>
+          <w:rFonts w:hint="eastAsia"/>
+        </w:rPr>
+        <w:t>AI</w:t>
+      </w:r>
+      <w:r>
+        <w:rPr>
+          <w:rFonts w:hint="eastAsia"/>
+        </w:rPr>
+        <w:t>）</w:t>
+      </w:r>
+      <w:r>
+        <w:rPr>
+          <w:rFonts w:hint="eastAsia"/>
+        </w:rPr>
+        <w:t>與視覺化的數位工具，能夠協助研究者處理上述</w:t>
+      </w:r>
+      <w:r>
+        <w:rPr>
+          <w:rFonts w:hint="eastAsia"/>
+        </w:rPr>
+        <w:t>難</w:t>
+      </w:r>
+      <w:r>
+        <w:rPr>
+          <w:rFonts w:hint="eastAsia"/>
+        </w:rPr>
+        <w:t>題</w:t>
+      </w:r>
+      <w:r>
+        <w:rPr>
+          <w:rFonts w:hint="eastAsia"/>
+        </w:rPr>
+        <w:t>，包括：</w:t>
+      </w:r>
+    </w:p>
+    <w:p>
+      <w:pPr>
+        <w:rPr>
+          <w:rFonts w:hint="eastAsia"/>
+          <w:lang w:val="en-US"/>
+        </w:rPr>
+      </w:pPr>
+    </w:p>
+    <w:p>
+      <w:r>
+        <w:rPr>
+          <w:rFonts w:hint="eastAsia"/>
+        </w:rPr>
+        <w:t>首先，利用</w:t>
+      </w:r>
+      <w:r>
+        <w:rPr>
+          <w:rFonts w:hint="eastAsia"/>
+        </w:rPr>
+        <w:t>AI</w:t>
+      </w:r>
+      <w:r>
+        <w:rPr>
+          <w:rFonts w:hint="eastAsia"/>
+        </w:rPr>
+        <w:t>總結</w:t>
+      </w:r>
+      <w:r>
+        <w:rPr>
+          <w:rFonts w:hint="eastAsia"/>
+        </w:rPr>
+        <w:t>長篇</w:t>
+      </w:r>
+      <w:r>
+        <w:rPr>
+          <w:rFonts w:hint="eastAsia"/>
+        </w:rPr>
+        <w:t>文本，並</w:t>
+      </w:r>
+      <w:r>
+        <w:rPr>
+          <w:rFonts w:hint="eastAsia"/>
+        </w:rPr>
+        <w:t>提取指定資訊</w:t>
+      </w:r>
+      <w:r>
+        <w:rPr>
+          <w:rFonts w:hint="eastAsia"/>
+        </w:rPr>
+        <w:t>。</w:t>
+      </w:r>
+      <w:r>
+        <w:rPr>
+          <w:rFonts w:hint="eastAsia"/>
+        </w:rPr>
+        <w:t>研究者可以</w:t>
+      </w:r>
+      <w:r>
+        <w:rPr>
+          <w:rFonts w:hint="eastAsia"/>
+        </w:rPr>
+        <w:t>先用</w:t>
+      </w:r>
+      <w:r>
+        <w:rPr>
+          <w:rFonts w:hint="eastAsia"/>
+        </w:rPr>
+        <w:t>AI</w:t>
+      </w:r>
+      <w:r>
+        <w:rPr>
+          <w:rFonts w:hint="eastAsia"/>
+        </w:rPr>
+        <w:t>總結每一份</w:t>
+      </w:r>
+      <w:r>
+        <w:rPr>
+          <w:rFonts w:hint="eastAsia"/>
+        </w:rPr>
+        <w:t>奏折與上諭，再</w:t>
+      </w:r>
+      <w:r>
+        <w:rPr>
+          <w:rFonts w:hint="eastAsia"/>
+        </w:rPr>
+        <w:t>閱讀</w:t>
+      </w:r>
+      <w:r>
+        <w:rPr>
+          <w:rFonts w:hint="eastAsia"/>
+        </w:rPr>
+        <w:t>AI</w:t>
+      </w:r>
+      <w:r>
+        <w:rPr>
+          <w:rFonts w:hint="eastAsia"/>
+        </w:rPr>
+        <w:t>生成的</w:t>
+      </w:r>
+      <w:r>
+        <w:rPr>
+          <w:rFonts w:hint="eastAsia"/>
+        </w:rPr>
+        <w:t>摘要</w:t>
+      </w:r>
+      <w:r>
+        <w:rPr>
+          <w:rFonts w:hint="eastAsia"/>
+        </w:rPr>
+        <w:t>，</w:t>
+      </w:r>
+      <w:r>
+        <w:rPr>
+          <w:rFonts w:hint="eastAsia"/>
+        </w:rPr>
+        <w:t>快速判斷文書是否包含值得深入分析的資訊</w:t>
+      </w:r>
+      <w:r>
+        <w:rPr>
+          <w:rFonts w:hint="eastAsia"/>
+        </w:rPr>
+        <w:t>，能</w:t>
+      </w:r>
+      <w:r>
+        <w:rPr>
+          <w:rFonts w:hint="eastAsia"/>
+        </w:rPr>
+        <w:t>據此決定</w:t>
+      </w:r>
+      <w:r>
+        <w:rPr>
+          <w:rFonts w:hint="eastAsia"/>
+        </w:rPr>
+        <w:t>是否深入閱讀該篇文書，</w:t>
+      </w:r>
+      <w:r>
+        <w:rPr>
+          <w:rFonts w:hint="eastAsia"/>
+        </w:rPr>
+        <w:t>從而減少</w:t>
+      </w:r>
+      <w:r>
+        <w:rPr>
+          <w:rFonts w:hint="eastAsia"/>
+        </w:rPr>
+        <w:t>閱讀</w:t>
+      </w:r>
+      <w:r>
+        <w:rPr>
+          <w:rFonts w:hint="eastAsia"/>
+        </w:rPr>
+        <w:t>材料的時間。</w:t>
       </w:r>
     </w:p>
     <w:p/>
     <w:p>
-      <w:pPr>
-        <w:rPr>
-          <w:rFonts w:hint="eastAsia"/>
-        </w:rPr>
-      </w:pPr>
-      <w:r>
-        <w:rPr>
-          <w:rFonts w:hint="eastAsia"/>
-        </w:rPr>
-        <w:t>硃批是皇帝收到奏折後留下的硃筆批答。（宋希斌，《清代軍機處職權的來源及其演變：以公文運轉程序與政局變動為核心的考察》，北京：中國社會科學出版社，</w:t>
-      </w:r>
-      <w:r>
-        <w:rPr>
-          <w:rFonts w:hint="eastAsia"/>
-        </w:rPr>
-        <w:t>2018</w:t>
-      </w:r>
-      <w:r>
-        <w:rPr>
-          <w:rFonts w:hint="eastAsia"/>
-        </w:rPr>
-        <w:t>年，頁碼待核。）</w:t>
+      <w:r>
+        <w:rPr>
+          <w:rFonts w:hint="eastAsia"/>
+        </w:rPr>
+        <w:t>其次，</w:t>
+      </w:r>
+      <w:r>
+        <w:rPr>
+          <w:rFonts w:hint="eastAsia"/>
+        </w:rPr>
+        <w:t>研究者可以按照不同研究問題設計不同的人工智能技能</w:t>
+      </w:r>
+      <w:r>
+        <w:rPr>
+          <w:rFonts w:hint="eastAsia"/>
+        </w:rPr>
+        <w:t>（</w:t>
+      </w:r>
+      <w:r>
+        <w:rPr>
+          <w:rFonts w:hint="eastAsia"/>
+        </w:rPr>
+        <w:t>AI Skills</w:t>
+      </w:r>
+      <w:r>
+        <w:rPr>
+          <w:rFonts w:hint="eastAsia"/>
+        </w:rPr>
+        <w:t>）</w:t>
+      </w:r>
+      <w:r>
+        <w:rPr>
+          <w:rFonts w:hint="eastAsia"/>
+        </w:rPr>
+        <w:t>，讓</w:t>
+      </w:r>
+      <w:r>
+        <w:rPr>
+          <w:rFonts w:hint="eastAsia"/>
+        </w:rPr>
+        <w:t>AI</w:t>
+      </w:r>
+      <w:r>
+        <w:rPr>
+          <w:rFonts w:hint="eastAsia"/>
+        </w:rPr>
+        <w:t>提取指定資訊。例如，在研究戰爭時，可以設計</w:t>
+      </w:r>
+      <w:r>
+        <w:rPr>
+          <w:rFonts w:hint="eastAsia"/>
+        </w:rPr>
+        <w:t>Skills</w:t>
+      </w:r>
+      <w:r>
+        <w:rPr>
+          <w:rFonts w:hint="eastAsia"/>
+        </w:rPr>
+        <w:t>，分別</w:t>
+      </w:r>
+      <w:r>
+        <w:rPr>
+          <w:rFonts w:hint="eastAsia"/>
+        </w:rPr>
+        <w:t>提取敵方軍事行動、清軍軍事行動、行動的消息來源等的資訊。</w:t>
       </w:r>
     </w:p>
     <w:p/>
@@ -492,19 +1353,67 @@
         <w:rPr>
           <w:rFonts w:hint="eastAsia"/>
         </w:rPr>
-        <w:t>上諭是皇帝向臣下發布的指示。廷寄則是清代處理和傳達機密諭旨的一種運轉方式。（宋希斌，《清代軍機處職權的來源及其演變：以公文運轉程序與政局變動為核心的考察》，北京：中國社會科學出版社，</w:t>
-      </w:r>
-      <w:r>
-        <w:rPr>
-          <w:rFonts w:hint="eastAsia"/>
-        </w:rPr>
-        <w:t>2018</w:t>
-      </w:r>
-      <w:r>
-        <w:rPr>
-          <w:rFonts w:hint="eastAsia"/>
-        </w:rPr>
-        <w:t>年，頁碼待核。）</w:t>
+        <w:t>每項</w:t>
+      </w:r>
+      <w:r>
+        <w:rPr>
+          <w:rFonts w:hint="eastAsia"/>
+        </w:rPr>
+        <w:t>Skills</w:t>
+      </w:r>
+      <w:r>
+        <w:rPr>
+          <w:rFonts w:hint="eastAsia"/>
+        </w:rPr>
+        <w:t>的結果都</w:t>
+      </w:r>
+      <w:r>
+        <w:rPr>
+          <w:rFonts w:hint="eastAsia"/>
+        </w:rPr>
+        <w:t>會</w:t>
+      </w:r>
+      <w:r>
+        <w:rPr>
+          <w:rFonts w:hint="eastAsia"/>
+        </w:rPr>
+        <w:t>包括原文引文及來源資料，</w:t>
+      </w:r>
+      <w:r>
+        <w:rPr>
+          <w:rFonts w:hint="eastAsia"/>
+        </w:rPr>
+        <w:t>確保研究者能夠</w:t>
+      </w:r>
+      <w:r>
+        <w:rPr>
+          <w:rFonts w:hint="eastAsia"/>
+        </w:rPr>
+        <w:t>追溯</w:t>
+      </w:r>
+      <w:r>
+        <w:rPr>
+          <w:rFonts w:hint="eastAsia"/>
+        </w:rPr>
+        <w:t>結果</w:t>
+      </w:r>
+      <w:r>
+        <w:rPr>
+          <w:rFonts w:hint="eastAsia"/>
+        </w:rPr>
+        <w:t>至原始文書的具體位置</w:t>
+      </w:r>
+      <w:r>
+        <w:rPr>
+          <w:rFonts w:hint="eastAsia"/>
+        </w:rPr>
+        <w:t>，並</w:t>
+      </w:r>
+      <w:r>
+        <w:rPr>
+          <w:rFonts w:hint="eastAsia"/>
+        </w:rPr>
+        <w:t>核對是否準確。</w:t>
       </w:r>
     </w:p>
     <w:p/>
@@ -518,121 +1427,460 @@
         <w:rPr>
           <w:rFonts w:hint="eastAsia"/>
         </w:rPr>
-        <w:t>奏折、硃批與上諭對清代政治的重要性，在於它們構成了皇帝與官僚體系之間的核心政治運作渠道。</w:t>
+        <w:t>另外，</w:t>
+      </w:r>
+      <w:r>
+        <w:rPr>
+          <w:rFonts w:hint="eastAsia"/>
+        </w:rPr>
+        <w:t>AI</w:t>
+      </w:r>
+      <w:r>
+        <w:rPr>
+          <w:rFonts w:hint="eastAsia"/>
+        </w:rPr>
+        <w:t>會輪出</w:t>
+      </w:r>
+      <w:r>
+        <w:rPr>
+          <w:rFonts w:hint="eastAsia"/>
+        </w:rPr>
+        <w:t>結構化</w:t>
+      </w:r>
+      <w:r>
+        <w:rPr>
+          <w:rFonts w:hint="eastAsia"/>
+        </w:rPr>
+        <w:t>的</w:t>
+      </w:r>
+      <w:r>
+        <w:rPr>
+          <w:rFonts w:hint="eastAsia"/>
+        </w:rPr>
+        <w:t>資料，</w:t>
+      </w:r>
+      <w:r>
+        <w:rPr>
+          <w:rFonts w:hint="eastAsia"/>
+        </w:rPr>
+        <w:t>方便</w:t>
+      </w:r>
+      <w:r>
+        <w:rPr>
+          <w:rFonts w:hint="eastAsia"/>
+        </w:rPr>
+        <w:t>載入</w:t>
+      </w:r>
+      <w:r>
+        <w:rPr>
+          <w:rFonts w:hint="eastAsia"/>
+        </w:rPr>
+        <w:t>至</w:t>
+      </w:r>
+      <w:r>
+        <w:rPr>
+          <w:rFonts w:hint="eastAsia"/>
+        </w:rPr>
+        <w:t>前端</w:t>
+      </w:r>
+      <w:r>
+        <w:rPr>
+          <w:rFonts w:hint="eastAsia"/>
+        </w:rPr>
+        <w:t>的</w:t>
+      </w:r>
+      <w:r>
+        <w:rPr>
+          <w:rFonts w:hint="eastAsia"/>
+        </w:rPr>
+        <w:t>網站，與原文並排顯示</w:t>
+      </w:r>
+      <w:r>
+        <w:rPr>
+          <w:rFonts w:hint="eastAsia"/>
+        </w:rPr>
+        <w:t>，讓</w:t>
+      </w:r>
+      <w:r>
+        <w:rPr>
+          <w:rFonts w:hint="eastAsia"/>
+        </w:rPr>
+        <w:t>研究者逐項閱讀和核對人工智能的分析，</w:t>
+      </w:r>
+      <w:r>
+        <w:rPr>
+          <w:rFonts w:hint="eastAsia"/>
+        </w:rPr>
+        <w:t>並</w:t>
+      </w:r>
+      <w:r>
+        <w:rPr>
+          <w:rFonts w:hint="eastAsia"/>
+        </w:rPr>
+        <w:t>選擇保留</w:t>
+      </w:r>
+      <w:r>
+        <w:rPr>
+          <w:rFonts w:hint="eastAsia"/>
+        </w:rPr>
+        <w:t>、修改或</w:t>
+      </w:r>
+      <w:r>
+        <w:rPr>
+          <w:rFonts w:hint="eastAsia"/>
+        </w:rPr>
+        <w:t>拒絕</w:t>
+      </w:r>
+      <w:r>
+        <w:rPr>
+          <w:rFonts w:hint="eastAsia"/>
+        </w:rPr>
+        <w:t>AI</w:t>
+      </w:r>
+      <w:r>
+        <w:rPr>
+          <w:rFonts w:hint="eastAsia"/>
+        </w:rPr>
+        <w:t>輪出的</w:t>
+      </w:r>
+      <w:r>
+        <w:rPr>
+          <w:rFonts w:hint="eastAsia"/>
+        </w:rPr>
+        <w:t>結果</w:t>
+      </w:r>
+      <w:r>
+        <w:rPr>
+          <w:rFonts w:hint="eastAsia"/>
+        </w:rPr>
+        <w:t>。</w:t>
       </w:r>
     </w:p>
     <w:p/>
     <w:p>
-      <w:pPr>
-        <w:rPr>
-          <w:rFonts w:hint="eastAsia"/>
-        </w:rPr>
-      </w:pPr>
-      <w:r>
-        <w:rPr>
-          <w:rFonts w:hint="eastAsia"/>
-        </w:rPr>
-        <w:t>奏折讓地方官員、督撫和軍政大臣直接向皇帝報告政務，使皇帝可以越過一般行政層級掌握地方情況，並對軍務、財政、人事和地方治理作出判斷。雍正以後，重要及機密的軍政事務更加依賴奏折上報，使奏折成為皇帝集中權力的重要工具。（王劍，〈近</w:t>
-      </w:r>
-      <w:r>
-        <w:rPr>
-          <w:rFonts w:hint="eastAsia"/>
-        </w:rPr>
-        <w:t>50</w:t>
-      </w:r>
-      <w:r>
-        <w:rPr>
-          <w:rFonts w:hint="eastAsia"/>
-        </w:rPr>
-        <w:t>年來清代奏折制度研究綜述〉，《中國史研究動態》，</w:t>
-      </w:r>
-      <w:r>
-        <w:rPr>
-          <w:rFonts w:hint="eastAsia"/>
-        </w:rPr>
-        <w:t>2004</w:t>
-      </w:r>
-      <w:r>
-        <w:rPr>
-          <w:rFonts w:hint="eastAsia"/>
-        </w:rPr>
-        <w:t>年第</w:t>
-      </w:r>
-      <w:r>
-        <w:rPr>
-          <w:rFonts w:hint="eastAsia"/>
-        </w:rPr>
-        <w:t>7</w:t>
-      </w:r>
-      <w:r>
-        <w:rPr>
-          <w:rFonts w:hint="eastAsia"/>
-        </w:rPr>
-        <w:t>期，頁</w:t>
-      </w:r>
-      <w:r>
-        <w:rPr>
-          <w:rFonts w:hint="eastAsia"/>
-        </w:rPr>
-        <w:t>20</w:t>
-      </w:r>
-      <w:r>
-        <w:rPr>
-          <w:rFonts w:hint="eastAsia"/>
-        </w:rPr>
-        <w:t>–</w:t>
-      </w:r>
-      <w:r>
-        <w:rPr>
-          <w:rFonts w:hint="eastAsia"/>
-        </w:rPr>
-        <w:t>21</w:t>
-      </w:r>
-      <w:r>
-        <w:rPr>
-          <w:rFonts w:hint="eastAsia"/>
-        </w:rPr>
-        <w:t>。）</w:t>
+      <w:r>
+        <w:rPr>
+          <w:rFonts w:hint="eastAsia"/>
+        </w:rPr>
+        <w:t>研究者也能利用數位工具重建和視覺化文本中的通信關係。首先，</w:t>
+      </w:r>
+      <w:r>
+        <w:rPr>
+          <w:rFonts w:hint="eastAsia"/>
+        </w:rPr>
+        <w:t>使用</w:t>
+      </w:r>
+      <w:r>
+        <w:rPr>
+          <w:rFonts w:hint="eastAsia"/>
+        </w:rPr>
+        <w:t>AI</w:t>
+      </w:r>
+      <w:r>
+        <w:rPr>
+          <w:rFonts w:hint="eastAsia"/>
+        </w:rPr>
+        <w:t>架設網站，展示</w:t>
+      </w:r>
+      <w:r>
+        <w:rPr>
+          <w:rFonts w:hint="eastAsia"/>
+        </w:rPr>
+        <w:t>兩條時間線：第一條顯示官員發出</w:t>
+      </w:r>
+      <w:r>
+        <w:rPr>
+          <w:rFonts w:hint="eastAsia"/>
+        </w:rPr>
+        <w:t>奏摺</w:t>
+      </w:r>
+      <w:r>
+        <w:rPr>
+          <w:rFonts w:hint="eastAsia"/>
+        </w:rPr>
+        <w:t>的時間，第二條顯示皇帝收到</w:t>
+      </w:r>
+      <w:r>
+        <w:rPr>
+          <w:rFonts w:hint="eastAsia"/>
+        </w:rPr>
+        <w:t>奏摺、</w:t>
+      </w:r>
+      <w:r>
+        <w:rPr>
+          <w:rFonts w:hint="eastAsia"/>
+        </w:rPr>
+        <w:t>作出硃批</w:t>
+      </w:r>
+      <w:r>
+        <w:rPr>
+          <w:rFonts w:hint="eastAsia"/>
+        </w:rPr>
+        <w:t>以及</w:t>
+      </w:r>
+      <w:r>
+        <w:rPr>
+          <w:rFonts w:hint="eastAsia"/>
+        </w:rPr>
+        <w:t>發布上諭的時間。這些資料根據奏折</w:t>
+      </w:r>
+      <w:r>
+        <w:rPr>
+          <w:rFonts w:hint="eastAsia"/>
+        </w:rPr>
+        <w:t>和上諭</w:t>
+      </w:r>
+      <w:r>
+        <w:rPr>
+          <w:rFonts w:hint="eastAsia"/>
+        </w:rPr>
+        <w:t>中已有的發出日期</w:t>
+      </w:r>
+      <w:r>
+        <w:rPr>
+          <w:rFonts w:hint="eastAsia"/>
+        </w:rPr>
+        <w:t>，以及</w:t>
+      </w:r>
+      <w:r>
+        <w:rPr>
+          <w:rFonts w:hint="eastAsia"/>
+        </w:rPr>
+        <w:t>奏折</w:t>
+      </w:r>
+      <w:r>
+        <w:rPr>
+          <w:rFonts w:hint="eastAsia"/>
+        </w:rPr>
+        <w:t>中的</w:t>
+      </w:r>
+      <w:r>
+        <w:rPr>
+          <w:rFonts w:hint="eastAsia"/>
+        </w:rPr>
+        <w:t>硃批日期整理而成，</w:t>
+      </w:r>
+      <w:r>
+        <w:rPr>
+          <w:rFonts w:hint="eastAsia"/>
+        </w:rPr>
+        <w:t>以此</w:t>
+      </w:r>
+      <w:r>
+        <w:rPr>
+          <w:rFonts w:hint="eastAsia"/>
+        </w:rPr>
+        <w:t>呈現中央與地方之間的</w:t>
+      </w:r>
+      <w:r>
+        <w:rPr>
+          <w:rFonts w:hint="eastAsia"/>
+        </w:rPr>
+        <w:t>第一層通訊關係。</w:t>
       </w:r>
     </w:p>
     <w:p/>
     <w:p>
-      <w:pPr>
-        <w:rPr>
-          <w:rFonts w:hint="eastAsia"/>
-        </w:rPr>
-      </w:pPr>
-      <w:r>
-        <w:rPr>
-          <w:rFonts w:hint="eastAsia"/>
-        </w:rPr>
-        <w:t>硃批則使皇帝能夠直接對官員的報告作出批答。皇帝可以透過硃批表示同意、提出質疑、下達要求，或要求官員繼續查報。因此，硃批不只是閱讀痕跡，也是皇帝干預行政和控制官員的重要方式。</w:t>
+      <w:r>
+        <w:rPr>
+          <w:rFonts w:hint="eastAsia"/>
+        </w:rPr>
+        <w:t>其次，</w:t>
+      </w:r>
+      <w:r>
+        <w:rPr>
+          <w:rFonts w:hint="eastAsia"/>
+        </w:rPr>
+        <w:t>利用</w:t>
+      </w:r>
+      <w:r>
+        <w:rPr>
+          <w:rFonts w:hint="eastAsia"/>
+        </w:rPr>
+        <w:t xml:space="preserve"> Python </w:t>
+      </w:r>
+      <w:r>
+        <w:rPr>
+          <w:rFonts w:hint="eastAsia"/>
+        </w:rPr>
+        <w:t>搜尋奏摺和上諭中的特定</w:t>
+      </w:r>
+      <w:r>
+        <w:rPr>
+          <w:rFonts w:hint="eastAsia"/>
+        </w:rPr>
+        <w:t>字眼</w:t>
+      </w:r>
+      <w:r>
+        <w:rPr>
+          <w:rFonts w:hint="eastAsia"/>
+        </w:rPr>
+        <w:t>，以辨識更深層的通信關係。例如，透過搜尋「據……奏」</w:t>
+      </w:r>
+      <w:r>
+        <w:rPr>
+          <w:rFonts w:hint="eastAsia"/>
+        </w:rPr>
+        <w:t>的字眼</w:t>
+      </w:r>
+      <w:r>
+        <w:rPr>
+          <w:rFonts w:hint="eastAsia"/>
+        </w:rPr>
+        <w:t>，判斷某道上諭所回應的官員奏摺</w:t>
+      </w:r>
+      <w:r>
+        <w:rPr>
+          <w:rFonts w:hint="eastAsia"/>
+        </w:rPr>
+        <w:t>；用</w:t>
+      </w:r>
+      <w:r>
+        <w:rPr>
+          <w:rFonts w:hint="eastAsia"/>
+        </w:rPr>
+        <w:t>「奉上諭」、「奉聖諭」、「奉硃批」</w:t>
+      </w:r>
+      <w:r>
+        <w:rPr>
+          <w:rFonts w:hint="eastAsia"/>
+        </w:rPr>
+        <w:t>、「</w:t>
+      </w:r>
+      <w:r>
+        <w:rPr>
+          <w:rFonts w:hint="eastAsia"/>
+        </w:rPr>
+        <w:t>奉廷寄</w:t>
+      </w:r>
+      <w:r>
+        <w:rPr>
+          <w:rFonts w:hint="eastAsia"/>
+        </w:rPr>
+        <w:t>」</w:t>
+      </w:r>
+      <w:r>
+        <w:rPr>
+          <w:rFonts w:ascii="Cambria Math" w:hAnsi="Cambria Math" w:cs="Cambria Math" w:hint="eastAsia"/>
+        </w:rPr>
+        <w:t>等</w:t>
+      </w:r>
+      <w:r>
+        <w:rPr>
+          <w:rFonts w:ascii="Cambria Math" w:hAnsi="Cambria Math" w:cs="Cambria Math" w:hint="eastAsia"/>
+        </w:rPr>
+        <w:t>字眼</w:t>
+      </w:r>
+      <w:r>
+        <w:rPr>
+          <w:rFonts w:ascii="Cambria Math" w:hAnsi="Cambria Math" w:cs="Cambria Math" w:hint="eastAsia"/>
+        </w:rPr>
+        <w:t>，</w:t>
+      </w:r>
+      <w:r>
+        <w:rPr>
+          <w:rFonts w:hint="eastAsia"/>
+        </w:rPr>
+        <w:t>判斷某份奏摺</w:t>
+      </w:r>
+      <w:r>
+        <w:rPr>
+          <w:rFonts w:hint="eastAsia"/>
+        </w:rPr>
+        <w:t>所回應的</w:t>
+      </w:r>
+      <w:r>
+        <w:rPr>
+          <w:rFonts w:hint="eastAsia"/>
+        </w:rPr>
+        <w:t>上諭</w:t>
+      </w:r>
+      <w:r>
+        <w:rPr>
+          <w:rFonts w:hint="eastAsia"/>
+        </w:rPr>
+        <w:t>。至於</w:t>
+      </w:r>
+      <w:r>
+        <w:rPr>
+          <w:rFonts w:hint="eastAsia"/>
+        </w:rPr>
+        <w:t>沒有標示上述</w:t>
+      </w:r>
+      <w:r>
+        <w:rPr>
+          <w:rFonts w:hint="eastAsia"/>
+        </w:rPr>
+        <w:t>字眼</w:t>
+      </w:r>
+      <w:r>
+        <w:rPr>
+          <w:rFonts w:hint="eastAsia"/>
+        </w:rPr>
+        <w:t>的文書，亦可以利用</w:t>
+      </w:r>
+      <w:r>
+        <w:rPr>
+          <w:rFonts w:hint="eastAsia"/>
+        </w:rPr>
+        <w:t>AI</w:t>
+      </w:r>
+      <w:r>
+        <w:rPr>
+          <w:rFonts w:hint="eastAsia"/>
+        </w:rPr>
+        <w:t>按照文本語義搜尋可能的對應文書，</w:t>
+      </w:r>
+      <w:r>
+        <w:rPr>
+          <w:rFonts w:hint="eastAsia"/>
+        </w:rPr>
+        <w:t>減少</w:t>
+      </w:r>
+      <w:r>
+        <w:rPr>
+          <w:rFonts w:hint="eastAsia"/>
+        </w:rPr>
+        <w:t>遺漏</w:t>
+      </w:r>
+      <w:r>
+        <w:rPr>
+          <w:rFonts w:hint="eastAsia"/>
+        </w:rPr>
+        <w:t>。</w:t>
       </w:r>
     </w:p>
     <w:p/>
     <w:p>
-      <w:pPr>
-        <w:rPr>
-          <w:rFonts w:hint="eastAsia"/>
-        </w:rPr>
-      </w:pPr>
-      <w:r>
-        <w:rPr>
-          <w:rFonts w:hint="eastAsia"/>
-        </w:rPr>
-        <w:t>上諭則把皇帝的判斷轉化為政治命令，傳達給地方官員和軍事將領。它可以任命或撤換官員、調動軍隊、分配糧餉、處理地方事件，並要求官員回奏結果。宋希斌指出，軍機處逐漸負責協助皇帝處理奏折、擬寫上諭和運轉廷寄，顯示這些文書與清代中樞決策機構密切相關。（宋希斌，《清代軍機處職權的來源及其演變：以公文運轉程序與政局變動為核心的考察》，北京：中國社會科學出版社，</w:t>
-      </w:r>
-      <w:r>
-        <w:rPr>
-          <w:rFonts w:hint="eastAsia"/>
-        </w:rPr>
-        <w:t>2018</w:t>
-      </w:r>
-      <w:r>
-        <w:rPr>
-          <w:rFonts w:hint="eastAsia"/>
-        </w:rPr>
-        <w:t>年，頁碼待核。）</w:t>
+      <w:r>
+        <w:rPr>
+          <w:rFonts w:hint="eastAsia"/>
+        </w:rPr>
+        <w:t>此外，圖表中另外還有兩條線，分別用來呈現官員奏報的</w:t>
+      </w:r>
+      <w:r>
+        <w:rPr>
+          <w:rFonts w:hint="eastAsia"/>
+        </w:rPr>
+        <w:t>事件或資訊</w:t>
+      </w:r>
+      <w:r>
+        <w:rPr>
+          <w:rFonts w:hint="eastAsia"/>
+        </w:rPr>
+        <w:t>，以及皇帝在硃批或上諭中的評論和命令。這些節點由上述特定的人工智能技能生成。人工智能技能會從文本中提取相關資訊，並提供主題句、詳細描述、原文引文及日期；待研究者核對並批准結果後，</w:t>
+      </w:r>
+      <w:r>
+        <w:rPr>
+          <w:rFonts w:hint="eastAsia"/>
+        </w:rPr>
+        <w:t>網站的</w:t>
+      </w:r>
+      <w:r>
+        <w:rPr>
+          <w:rFonts w:hint="eastAsia"/>
+        </w:rPr>
+        <w:t>系統便會在相應的圖表線上新增節點。</w:t>
       </w:r>
     </w:p>
     <w:p/>
@@ -647,701 +1895,140 @@
           <w:rFonts w:hint="eastAsia"/>
         </w:rPr>
         <w:lastRenderedPageBreak/>
-        <w:t>它們也讓皇帝可以在中央集權和地方治理之間建立連接。地方官員透過奏折上報地方問題，皇帝透過硃批和上諭作出回應，再要求地方官員執行和回奏。這形成了：</w:t>
-      </w:r>
-    </w:p>
-    <w:p/>
-    <w:p>
-      <w:r>
-        <w:rPr>
-          <w:rFonts w:hint="eastAsia"/>
-        </w:rPr>
-        <w:t>`</w:t>
-      </w:r>
-      <w:r>
-        <w:rPr>
-          <w:rFonts w:hint="eastAsia"/>
-        </w:rPr>
-        <w:t>地方上報</w:t>
-      </w:r>
-      <w:r>
-        <w:rPr>
-          <w:rFonts w:hint="eastAsia"/>
-        </w:rPr>
-        <w:t xml:space="preserve"> </w:t>
-      </w:r>
-      <w:r>
-        <w:rPr>
-          <w:rFonts w:hint="eastAsia"/>
-        </w:rPr>
-        <w:t>→</w:t>
-      </w:r>
-      <w:r>
-        <w:rPr>
-          <w:rFonts w:hint="eastAsia"/>
-        </w:rPr>
-        <w:t xml:space="preserve"> </w:t>
-      </w:r>
-      <w:r>
-        <w:rPr>
-          <w:rFonts w:hint="eastAsia"/>
-        </w:rPr>
-        <w:t>皇帝批答</w:t>
-      </w:r>
-      <w:r>
-        <w:rPr>
-          <w:rFonts w:hint="eastAsia"/>
-        </w:rPr>
-        <w:t xml:space="preserve"> </w:t>
-      </w:r>
-      <w:r>
-        <w:rPr>
-          <w:rFonts w:hint="eastAsia"/>
-        </w:rPr>
-        <w:t>→</w:t>
-      </w:r>
-      <w:r>
-        <w:rPr>
-          <w:rFonts w:hint="eastAsia"/>
-        </w:rPr>
-        <w:t xml:space="preserve"> </w:t>
-      </w:r>
-      <w:r>
-        <w:rPr>
-          <w:rFonts w:hint="eastAsia"/>
-        </w:rPr>
-        <w:t>中央下令</w:t>
-      </w:r>
-      <w:r>
-        <w:rPr>
-          <w:rFonts w:hint="eastAsia"/>
-        </w:rPr>
-        <w:t xml:space="preserve"> </w:t>
-      </w:r>
-      <w:r>
-        <w:rPr>
-          <w:rFonts w:hint="eastAsia"/>
-        </w:rPr>
-        <w:t>→</w:t>
-      </w:r>
-      <w:r>
-        <w:rPr>
-          <w:rFonts w:hint="eastAsia"/>
-        </w:rPr>
-        <w:t xml:space="preserve"> </w:t>
-      </w:r>
-      <w:r>
-        <w:rPr>
-          <w:rFonts w:hint="eastAsia"/>
-        </w:rPr>
-        <w:t>地方執行</w:t>
-      </w:r>
-      <w:r>
-        <w:rPr>
-          <w:rFonts w:hint="eastAsia"/>
-        </w:rPr>
-        <w:t xml:space="preserve"> </w:t>
-      </w:r>
-      <w:r>
-        <w:rPr>
-          <w:rFonts w:hint="eastAsia"/>
-        </w:rPr>
-        <w:t>→</w:t>
-      </w:r>
-      <w:r>
-        <w:rPr>
-          <w:rFonts w:hint="eastAsia"/>
-        </w:rPr>
-        <w:t xml:space="preserve"> </w:t>
-      </w:r>
-      <w:r>
-        <w:rPr>
-          <w:rFonts w:hint="eastAsia"/>
-        </w:rPr>
-        <w:t>官員回奏</w:t>
-      </w:r>
-      <w:r>
-        <w:rPr>
-          <w:rFonts w:hint="eastAsia"/>
-        </w:rPr>
-        <w:t>`</w:t>
-      </w:r>
-    </w:p>
-    <w:p/>
-    <w:p>
-      <w:r>
-        <w:br w:type="page"/>
-      </w:r>
-    </w:p>
-    <w:p>
-      <w:pPr>
-        <w:rPr>
-          <w:rFonts w:hint="eastAsia"/>
-        </w:rPr>
-      </w:pPr>
-      <w:r>
-        <w:rPr>
-          <w:rFonts w:hint="eastAsia"/>
-        </w:rPr>
-        <w:lastRenderedPageBreak/>
-        <w:t xml:space="preserve">### </w:t>
-      </w:r>
-      <w:r>
-        <w:rPr>
-          <w:rFonts w:hint="eastAsia"/>
-        </w:rPr>
-        <w:t>可直接使用的文字</w:t>
-      </w:r>
-    </w:p>
-    <w:p/>
-    <w:p>
-      <w:pPr>
-        <w:rPr>
-          <w:rFonts w:hint="eastAsia"/>
-        </w:rPr>
-      </w:pPr>
-      <w:r>
-        <w:rPr>
-          <w:rFonts w:hint="eastAsia"/>
-        </w:rPr>
-        <w:t>奏折、硃批與上諭是研究清代政治和歷史的重要第一手史料。它們直接保存地方官員與中央政府之間的通信過程：奏折記錄地方官員如何向皇帝報告政務和軍情；硃批保存皇帝對奏折的批答；上諭則記錄皇帝如何向地方官員發布命令和作出政治判斷。</w:t>
-      </w:r>
-    </w:p>
-    <w:p/>
-    <w:p>
-      <w:pPr>
-        <w:rPr>
-          <w:rFonts w:hint="eastAsia"/>
-        </w:rPr>
-      </w:pPr>
-      <w:r>
-        <w:rPr>
-          <w:rFonts w:hint="eastAsia"/>
-        </w:rPr>
-        <w:t>這些文書的重要性在於，它們不是在事件結束後才形成的完整歷史敘事，而是在政治決策和行政行動進行期間產生的原始記錄。研究者可以透過奏折、硃批和上諭追問：地方官員當時知道甚麼？他們如何向中央描述情勢？皇帝根據哪些資訊作出決定？命令又如何傳回地方執行？王劍指出，奏折是清代特有的重要上行官文書；隨著大量宮藏奏折被整理和公開，其史料價值也逐漸受到學界重視。（王劍，〈近</w:t>
-      </w:r>
-      <w:r>
-        <w:rPr>
-          <w:rFonts w:hint="eastAsia"/>
-        </w:rPr>
-        <w:t>50</w:t>
-      </w:r>
-      <w:r>
-        <w:rPr>
-          <w:rFonts w:hint="eastAsia"/>
-        </w:rPr>
-        <w:t>年來清代奏折制度研究綜述〉，《中國史研究動態》，</w:t>
-      </w:r>
-      <w:r>
-        <w:rPr>
-          <w:rFonts w:hint="eastAsia"/>
-        </w:rPr>
-        <w:t>2004</w:t>
-      </w:r>
-      <w:r>
-        <w:rPr>
-          <w:rFonts w:hint="eastAsia"/>
-        </w:rPr>
-        <w:t>年第</w:t>
-      </w:r>
-      <w:r>
-        <w:rPr>
-          <w:rFonts w:hint="eastAsia"/>
-        </w:rPr>
-        <w:t>7</w:t>
-      </w:r>
-      <w:r>
-        <w:rPr>
-          <w:rFonts w:hint="eastAsia"/>
-        </w:rPr>
-        <w:t>期，頁</w:t>
-      </w:r>
-      <w:r>
-        <w:rPr>
-          <w:rFonts w:hint="eastAsia"/>
-        </w:rPr>
-        <w:t>20</w:t>
-      </w:r>
-      <w:r>
-        <w:rPr>
-          <w:rFonts w:hint="eastAsia"/>
-        </w:rPr>
-        <w:t>–</w:t>
-      </w:r>
-      <w:r>
-        <w:rPr>
-          <w:rFonts w:hint="eastAsia"/>
-        </w:rPr>
-        <w:t>21</w:t>
-      </w:r>
-      <w:r>
-        <w:rPr>
-          <w:rFonts w:hint="eastAsia"/>
-        </w:rPr>
-        <w:t>。）</w:t>
-      </w:r>
-    </w:p>
-    <w:p/>
-    <w:p>
-      <w:pPr>
-        <w:rPr>
-          <w:rFonts w:hint="eastAsia"/>
-        </w:rPr>
-      </w:pPr>
-      <w:r>
-        <w:rPr>
-          <w:rFonts w:hint="eastAsia"/>
-        </w:rPr>
-        <w:t>同時，奏折、硃批與上諭也是研究其他清代重要歷史文獻的基礎材料。《清實錄》、方略和地方志等文獻，通常是在事件發生後，經過官方或地方編纂者整理、選擇和重新組織而形成。研究者可以利用這些後來的編纂文獻了解清代官方如何建構歷史記憶，再回到奏折、硃批和上諭，核對哪些原始資訊被保留、刪除、重組或重新解釋。秦國經對清代檔案和文書制度的整理，也顯示奏折、硃批和諭旨是理解清代政治文書及其後續歷史編纂的重要基礎。（秦國經，《明清檔案學》，北京：學苑出版社，</w:t>
-      </w:r>
-      <w:r>
-        <w:rPr>
-          <w:rFonts w:hint="eastAsia"/>
-        </w:rPr>
-        <w:t>2005</w:t>
-      </w:r>
-      <w:r>
-        <w:rPr>
-          <w:rFonts w:hint="eastAsia"/>
-        </w:rPr>
-        <w:t>年，頁碼待核。）</w:t>
-      </w:r>
-    </w:p>
-    <w:p/>
-    <w:p>
-      <w:pPr>
-        <w:rPr>
-          <w:rFonts w:hint="eastAsia"/>
-        </w:rPr>
-      </w:pPr>
-      <w:r>
-        <w:rPr>
-          <w:rFonts w:hint="eastAsia"/>
-        </w:rPr>
-        <w:t>因此，這些史料可以理解為一個歷史證據層次：</w:t>
-      </w:r>
-    </w:p>
-    <w:p/>
-    <w:p>
-      <w:pPr>
-        <w:rPr>
-          <w:rFonts w:hint="eastAsia"/>
-        </w:rPr>
-      </w:pPr>
-      <w:r>
-        <w:rPr>
-          <w:rFonts w:hint="eastAsia"/>
-        </w:rPr>
-        <w:t>`</w:t>
-      </w:r>
-      <w:r>
-        <w:rPr>
-          <w:rFonts w:hint="eastAsia"/>
-        </w:rPr>
-        <w:t>奏折／硃批／上諭：政治通信的直接記錄</w:t>
-      </w:r>
-      <w:r>
-        <w:rPr>
-          <w:rFonts w:hint="eastAsia"/>
-        </w:rPr>
-        <w:t xml:space="preserve"> </w:t>
-      </w:r>
-      <w:r>
-        <w:rPr>
-          <w:rFonts w:hint="eastAsia"/>
-        </w:rPr>
-        <w:t>→</w:t>
-      </w:r>
-      <w:r>
-        <w:rPr>
-          <w:rFonts w:hint="eastAsia"/>
-        </w:rPr>
-        <w:t xml:space="preserve"> </w:t>
-      </w:r>
-      <w:r>
-        <w:rPr>
-          <w:rFonts w:hint="eastAsia"/>
-        </w:rPr>
-        <w:t>方略／《清實錄》／地方志：對原始材料的整理和歷史敘述</w:t>
-      </w:r>
-      <w:r>
-        <w:rPr>
-          <w:rFonts w:hint="eastAsia"/>
-        </w:rPr>
-        <w:t>`</w:t>
-      </w:r>
-    </w:p>
-    <w:p/>
-    <w:p>
-      <w:r>
-        <w:rPr>
-          <w:rFonts w:hint="eastAsia"/>
-        </w:rPr>
-        <w:t>透過這種比較，研究者不只能知道清代官方最後如何描述一場政治事件或戰爭，也能研究歷史敘述是如何由原始通信逐步形成的。屬於最接近政治現場的奏折、硃批與上諭，因而是分析清代政治運作、中央與地方關係，以及官方歷史記憶形成過程的核心材料。</w:t>
-      </w:r>
-    </w:p>
-    <w:p>
-      <w:r>
-        <w:br w:type="page"/>
-      </w:r>
-    </w:p>
-    <w:p>
-      <w:pPr>
-        <w:rPr>
-          <w:rFonts w:hint="eastAsia"/>
-        </w:rPr>
-      </w:pPr>
-      <w:r>
-        <w:rPr>
-          <w:rFonts w:hint="eastAsia"/>
-        </w:rPr>
-        <w:lastRenderedPageBreak/>
-        <w:t xml:space="preserve">#### </w:t>
-      </w:r>
-      <w:r>
-        <w:rPr>
-          <w:rFonts w:hint="eastAsia"/>
-        </w:rPr>
-        <w:t>為甚麼奏折與上諭難以研究？</w:t>
-      </w:r>
-    </w:p>
-    <w:p/>
-    <w:p>
-      <w:pPr>
-        <w:rPr>
-          <w:rFonts w:hint="eastAsia"/>
-        </w:rPr>
-      </w:pPr>
-      <w:r>
-        <w:rPr>
-          <w:rFonts w:hint="eastAsia"/>
-        </w:rPr>
-        <w:t>奏折和上諭留下了大量關於清代政治、地方治理和戰爭的記錄，但數量龐大</w:t>
-      </w:r>
-    </w:p>
-    <w:p>
-      <w:pPr>
-        <w:rPr>
-          <w:rFonts w:hint="eastAsia"/>
-        </w:rPr>
-      </w:pPr>
-      <w:r>
-        <w:rPr>
-          <w:rFonts w:hint="eastAsia"/>
-        </w:rPr>
-        <w:t>並不代表它們可以直接拼成一個完整故事。</w:t>
-      </w:r>
-    </w:p>
-    <w:p/>
-    <w:p>
-      <w:pPr>
-        <w:rPr>
-          <w:rFonts w:hint="eastAsia"/>
-        </w:rPr>
-      </w:pPr>
-      <w:r>
-        <w:rPr>
-          <w:rFonts w:hint="eastAsia"/>
-        </w:rPr>
-        <w:t>第二個困難，是文書上的「日期」不只有一個。研究者可能需要區分事件</w:t>
-      </w:r>
-    </w:p>
-    <w:p>
-      <w:pPr>
-        <w:rPr>
-          <w:rFonts w:hint="eastAsia"/>
-        </w:rPr>
-      </w:pPr>
-      <w:r>
-        <w:rPr>
-          <w:rFonts w:hint="eastAsia"/>
-        </w:rPr>
-        <w:t>發生日期、官員發出奏折的日期、皇帝收到奏折並作硃批的日期、上諭發布的</w:t>
-      </w:r>
-    </w:p>
-    <w:p>
-      <w:pPr>
-        <w:rPr>
-          <w:rFonts w:hint="eastAsia"/>
-        </w:rPr>
-      </w:pPr>
-      <w:r>
-        <w:rPr>
-          <w:rFonts w:hint="eastAsia"/>
-        </w:rPr>
-        <w:t>日期，以及官員收到上諭的日期。這些日期有時並不完整，甚至需要根據</w:t>
-      </w:r>
-    </w:p>
-    <w:p>
-      <w:pPr>
-        <w:rPr>
-          <w:rFonts w:hint="eastAsia"/>
-        </w:rPr>
-      </w:pPr>
-      <w:r>
-        <w:rPr>
-          <w:rFonts w:hint="eastAsia"/>
-        </w:rPr>
-        <w:t>奏折正文中「接到」或「奉到」某日上諭的語句反推。以福康安等人的台</w:t>
-      </w:r>
-      <w:r>
-        <w:rPr>
-          <w:rFonts w:hint="eastAsia"/>
-        </w:rPr>
-        <w:t>951</w:t>
-      </w:r>
-    </w:p>
-    <w:p>
-      <w:pPr>
-        <w:rPr>
-          <w:rFonts w:hint="eastAsia"/>
-        </w:rPr>
-      </w:pPr>
-      <w:r>
-        <w:rPr>
-          <w:rFonts w:hint="eastAsia"/>
-        </w:rPr>
-        <w:t>為例，文件記錄的發出日期是</w:t>
-      </w:r>
-      <w:r>
-        <w:rPr>
-          <w:rFonts w:hint="eastAsia"/>
-        </w:rPr>
-        <w:t>1787</w:t>
-      </w:r>
-      <w:r>
-        <w:rPr>
-          <w:rFonts w:hint="eastAsia"/>
-        </w:rPr>
-        <w:t>年</w:t>
-      </w:r>
-      <w:r>
-        <w:rPr>
-          <w:rFonts w:hint="eastAsia"/>
-        </w:rPr>
-        <w:t>9</w:t>
-      </w:r>
-      <w:r>
-        <w:rPr>
-          <w:rFonts w:hint="eastAsia"/>
-        </w:rPr>
-        <w:t>月</w:t>
-      </w:r>
-      <w:r>
-        <w:rPr>
-          <w:rFonts w:hint="eastAsia"/>
-        </w:rPr>
-        <w:t>24</w:t>
-      </w:r>
-      <w:r>
-        <w:rPr>
-          <w:rFonts w:hint="eastAsia"/>
-        </w:rPr>
-        <w:t>日，而收到／硃批日期是同年</w:t>
-      </w:r>
-      <w:r>
-        <w:rPr>
-          <w:rFonts w:hint="eastAsia"/>
-        </w:rPr>
-        <w:t>10</w:t>
-      </w:r>
-      <w:r>
-        <w:rPr>
-          <w:rFonts w:hint="eastAsia"/>
-        </w:rPr>
-        <w:t>月</w:t>
-      </w:r>
-      <w:r>
-        <w:rPr>
-          <w:rFonts w:hint="eastAsia"/>
-        </w:rPr>
-        <w:t>7</w:t>
-      </w:r>
-      <w:r>
-        <w:rPr>
-          <w:rFonts w:hint="eastAsia"/>
-        </w:rPr>
-        <w:t>日，</w:t>
-      </w:r>
-    </w:p>
-    <w:p>
-      <w:pPr>
-        <w:rPr>
-          <w:rFonts w:hint="eastAsia"/>
-        </w:rPr>
-      </w:pPr>
-      <w:r>
-        <w:rPr>
-          <w:rFonts w:hint="eastAsia"/>
-        </w:rPr>
-        <w:t>中間相隔十三日。這段時間對正在渡海和作戰的官員而言，可能足以讓戰場</w:t>
-      </w:r>
-    </w:p>
-    <w:p>
-      <w:r>
-        <w:rPr>
-          <w:rFonts w:hint="eastAsia"/>
-        </w:rPr>
-        <w:t>形勢發生變化。</w:t>
-      </w:r>
-    </w:p>
-    <w:p/>
-    <w:p>
-      <w:pPr>
-        <w:rPr>
-          <w:rFonts w:hint="eastAsia"/>
-        </w:rPr>
-      </w:pPr>
-      <w:r>
-        <w:rPr>
-          <w:rFonts w:hint="eastAsia"/>
-        </w:rPr>
-        <w:t>第一個困難，是它們不是一組整齊的來回對話。官員可能先後多次呈報同一</w:t>
-      </w:r>
-    </w:p>
-    <w:p>
-      <w:pPr>
-        <w:rPr>
-          <w:rFonts w:hint="eastAsia"/>
-        </w:rPr>
-      </w:pPr>
-      <w:r>
-        <w:rPr>
-          <w:rFonts w:hint="eastAsia"/>
-        </w:rPr>
-        <w:t>問題，皇帝也可能根據不同時間收到的消息，先後發出幾道內容不同的上諭。</w:t>
-      </w:r>
-    </w:p>
-    <w:p>
-      <w:pPr>
-        <w:rPr>
-          <w:rFonts w:hint="eastAsia"/>
-        </w:rPr>
-      </w:pPr>
-      <w:r>
-        <w:rPr>
-          <w:rFonts w:hint="eastAsia"/>
-        </w:rPr>
-        <w:t>一份文件有時只提到「前奏」或「前旨」，卻不完整列出所回應的文件；同一</w:t>
-      </w:r>
-    </w:p>
-    <w:p>
-      <w:pPr>
-        <w:rPr>
-          <w:rFonts w:hint="eastAsia"/>
-        </w:rPr>
-      </w:pPr>
-      <w:r>
-        <w:rPr>
-          <w:rFonts w:hint="eastAsia"/>
-        </w:rPr>
-        <w:t>場戰事也可能由前線官員、福建後方大臣和北京官員從不同位置加以描述。</w:t>
-      </w:r>
-    </w:p>
-    <w:p>
-      <w:pPr>
-        <w:rPr>
-          <w:rFonts w:hint="eastAsia"/>
-        </w:rPr>
-      </w:pPr>
-      <w:r>
-        <w:rPr>
-          <w:rFonts w:hint="eastAsia"/>
-        </w:rPr>
-        <w:t>因此，研究者不能只按照文件出現的次序閱讀，而要比較文句、人物、地點和</w:t>
-      </w:r>
-    </w:p>
-    <w:p>
-      <w:pPr>
-        <w:rPr>
-          <w:rFonts w:hint="eastAsia"/>
-        </w:rPr>
-      </w:pPr>
-      <w:r>
-        <w:rPr>
-          <w:rFonts w:hint="eastAsia"/>
-        </w:rPr>
-        <w:t>事件，逐步重建它們之間可能存在的關係。</w:t>
-      </w:r>
-    </w:p>
-    <w:p/>
-    <w:p>
-      <w:pPr>
-        <w:rPr>
-          <w:rFonts w:hint="eastAsia"/>
-        </w:rPr>
-      </w:pPr>
-      <w:r>
-        <w:rPr>
-          <w:rFonts w:hint="eastAsia"/>
-        </w:rPr>
-        <w:t>第三個困難，是文書本身不是透明而完整的現場記錄。官員需要在奏折中選擇</w:t>
-      </w:r>
-    </w:p>
-    <w:p>
-      <w:pPr>
-        <w:rPr>
-          <w:rFonts w:hint="eastAsia"/>
-        </w:rPr>
-      </w:pPr>
-      <w:r>
-        <w:rPr>
-          <w:rFonts w:hint="eastAsia"/>
-        </w:rPr>
-        <w:t>如何描述戰況、解釋延誤和提出請求；皇帝則只能根據已經送達的材料判斷前線</w:t>
-      </w:r>
-    </w:p>
-    <w:p>
-      <w:pPr>
-        <w:rPr>
-          <w:rFonts w:hint="eastAsia"/>
-        </w:rPr>
-      </w:pPr>
-      <w:r>
-        <w:rPr>
-          <w:rFonts w:hint="eastAsia"/>
-        </w:rPr>
-        <w:t>情勢。不同官員的資訊位置不一樣：前線將領較早接觸戰場，福建後方官員負責</w:t>
-      </w:r>
-    </w:p>
-    <w:p>
-      <w:pPr>
-        <w:rPr>
-          <w:rFonts w:hint="eastAsia"/>
-        </w:rPr>
-      </w:pPr>
-      <w:r>
-        <w:rPr>
-          <w:rFonts w:hint="eastAsia"/>
-        </w:rPr>
-        <w:t>接收和轉報消息，北京的皇帝則擁有最高決策權，卻可能最晚收到最新情報。由此</w:t>
-      </w:r>
-    </w:p>
-    <w:p>
-      <w:pPr>
-        <w:rPr>
-          <w:rFonts w:hint="eastAsia"/>
-        </w:rPr>
-      </w:pPr>
-      <w:r>
-        <w:rPr>
-          <w:rFonts w:hint="eastAsia"/>
-        </w:rPr>
-        <w:t>可見，研究者不只要問「發生了甚麼」，還要問「誰在甚麼時候知道甚麼」，以及</w:t>
-      </w:r>
-    </w:p>
-    <w:p>
-      <w:pPr>
-        <w:rPr>
-          <w:rFonts w:hint="eastAsia"/>
-        </w:rPr>
-      </w:pPr>
-      <w:r>
-        <w:rPr>
-          <w:rFonts w:hint="eastAsia"/>
-        </w:rPr>
-        <w:t>「哪些資訊在傳遞、整理和回應的過程中被保留、改變或延遲」。</w:t>
-      </w:r>
+        <w:t>圖表上的第一條線代表事件實際發生的時間。事件節點可以連接至官員奏報節點，表示該事件何時由哪一份奏摺上報；官員奏報節點再可以連接至硃批或上諭節點，表示皇帝何時收到並回應相關資訊。硃批或上諭節點亦可以連接至皇帝行動節點，呈現皇帝就該項資訊作出的命令、評論或其他行動。最後，皇帝行動節點還可以連接至後續的官員奏摺，顯示地方官員何時回應或執行皇帝的命令。如此一來，圖表便能將不同層次的</w:t>
+      </w:r>
+      <w:r>
+        <w:rPr>
+          <w:rFonts w:hint="eastAsia"/>
+        </w:rPr>
+        <w:t>通信關係</w:t>
+      </w:r>
+      <w:r>
+        <w:rPr>
+          <w:rFonts w:hint="eastAsia"/>
+        </w:rPr>
+        <w:t>連接起來。</w:t>
+      </w:r>
+    </w:p>
+    <w:p>
+      <w:pPr>
+        <w:rPr>
+          <w:rFonts w:hint="eastAsia"/>
+          <w:lang w:val="en-US"/>
+        </w:rPr>
+      </w:pPr>
+    </w:p>
+    <w:p>
+      <w:pPr>
+        <w:rPr>
+          <w:rFonts w:hint="eastAsia"/>
+          <w:lang w:val="en-US"/>
+        </w:rPr>
+      </w:pPr>
+      <w:r>
+        <w:rPr>
+          <w:rFonts w:hint="eastAsia"/>
+        </w:rPr>
+        <w:t>因此，</w:t>
+      </w:r>
+      <w:r>
+        <w:rPr>
+          <w:rFonts w:hint="eastAsia"/>
+        </w:rPr>
+        <w:t xml:space="preserve">AI </w:t>
+      </w:r>
+      <w:r>
+        <w:rPr>
+          <w:rFonts w:hint="eastAsia"/>
+        </w:rPr>
+        <w:t>在本網站中主要負責「大量閱讀後的候選提取」，而不是直接作出歷史結論。研究者仍然需要檢查原文、確認關係，並決定哪些結果可以加入圖表。這種「</w:t>
+      </w:r>
+      <w:r>
+        <w:rPr>
+          <w:rFonts w:hint="eastAsia"/>
+        </w:rPr>
+        <w:t xml:space="preserve">AI </w:t>
+      </w:r>
+      <w:r>
+        <w:rPr>
+          <w:rFonts w:hint="eastAsia"/>
+        </w:rPr>
+        <w:t>提出候選、研究者確認證據」的流程，是本專案</w:t>
+      </w:r>
+      <w:r>
+        <w:rPr>
+          <w:rFonts w:hint="eastAsia"/>
+        </w:rPr>
+        <w:t xml:space="preserve"> AI </w:t>
+      </w:r>
+      <w:r>
+        <w:rPr>
+          <w:rFonts w:hint="eastAsia"/>
+        </w:rPr>
+        <w:t>審閱迴圈的核心設計。（本專案〈官文優先</w:t>
+      </w:r>
+      <w:r>
+        <w:rPr>
+          <w:rFonts w:hint="eastAsia"/>
+        </w:rPr>
+        <w:t xml:space="preserve"> AI </w:t>
+      </w:r>
+      <w:r>
+        <w:rPr>
+          <w:rFonts w:hint="eastAsia"/>
+        </w:rPr>
+        <w:t>審閱迴圈〉工作規格，</w:t>
+      </w:r>
+      <w:r>
+        <w:rPr>
+          <w:rFonts w:hint="eastAsia"/>
+        </w:rPr>
+        <w:t>2026</w:t>
+      </w:r>
+      <w:r>
+        <w:rPr>
+          <w:rFonts w:hint="eastAsia"/>
+        </w:rPr>
+        <w:t>年，頁碼不適用；本專案〈</w:t>
+      </w:r>
+      <w:r>
+        <w:rPr>
+          <w:rFonts w:hint="eastAsia"/>
+        </w:rPr>
+        <w:t>Project overview</w:t>
+      </w:r>
+      <w:r>
+        <w:rPr>
+          <w:rFonts w:hint="eastAsia"/>
+        </w:rPr>
+        <w:t>〉工作說明，</w:t>
+      </w:r>
+      <w:r>
+        <w:rPr>
+          <w:rFonts w:hint="eastAsia"/>
+        </w:rPr>
+        <w:t>2026</w:t>
+      </w:r>
+      <w:r>
+        <w:rPr>
+          <w:rFonts w:hint="eastAsia"/>
+        </w:rPr>
+        <w:t>年，頁碼不適用。）</w:t>
+      </w:r>
+    </w:p>
+    <w:p>
+      <w:pPr>
+        <w:rPr>
+          <w:rFonts w:hint="eastAsia"/>
+        </w:rPr>
+      </w:pPr>
+    </w:p>
+    <w:p>
+      <w:pPr>
+        <w:rPr>
+          <w:rFonts w:hint="eastAsia"/>
+        </w:rPr>
+      </w:pPr>
     </w:p>
     <w:p/>
     <w:p/>
@@ -1355,66 +2042,13 @@
         <w:rPr>
           <w:rFonts w:hint="eastAsia"/>
         </w:rPr>
-        <w:t>最後，單靠按順序閱讀的純文字，很難同時看見這些層次。文字可以保存原文</w:t>
-      </w:r>
-    </w:p>
-    <w:p>
-      <w:pPr>
-        <w:rPr>
-          <w:rFonts w:hint="eastAsia"/>
-        </w:rPr>
-      </w:pPr>
-      <w:r>
-        <w:rPr>
-          <w:rFonts w:hint="eastAsia"/>
-        </w:rPr>
-        <w:t>和細節，卻不容易讓研究者一眼看出文件之間的時間差、回應關係、人物位置和</w:t>
-      </w:r>
-    </w:p>
-    <w:p>
-      <w:pPr>
-        <w:rPr>
-          <w:rFonts w:hint="eastAsia"/>
-        </w:rPr>
-      </w:pPr>
-      <w:r>
-        <w:rPr>
-          <w:rFonts w:hint="eastAsia"/>
-        </w:rPr>
-        <w:t>地理距離。這也是本網站需要把原文保留下來，再以結構化資料、時間線和關係</w:t>
-      </w:r>
-    </w:p>
-    <w:p>
-      <w:pPr>
-        <w:rPr>
-          <w:rFonts w:hint="eastAsia"/>
-        </w:rPr>
-      </w:pPr>
-      <w:r>
-        <w:rPr>
-          <w:rFonts w:hint="eastAsia"/>
-        </w:rPr>
-        <w:t>圖表輔助閱讀的原因。</w:t>
-      </w:r>
-      <w:r>
-        <w:rPr>
-          <w:rFonts w:hint="eastAsia"/>
-        </w:rPr>
-        <w:t xml:space="preserve">AI </w:t>
-      </w:r>
-      <w:r>
-        <w:rPr>
-          <w:rFonts w:hint="eastAsia"/>
-        </w:rPr>
-        <w:t>可以協助從大量文字中提出日期、人物、行動和可能的</w:t>
-      </w:r>
-    </w:p>
-    <w:p>
-      <w:r>
-        <w:rPr>
-          <w:rFonts w:hint="eastAsia"/>
-        </w:rPr>
-        <w:t>文件關係，但每一項結果仍然需要回到原文，由研究者核對和判斷。</w:t>
+        <w:t xml:space="preserve">#### </w:t>
+      </w:r>
+      <w:r>
+        <w:rPr>
+          <w:rFonts w:hint="eastAsia"/>
+        </w:rPr>
+        <w:t>一、以時間線和四條關係分道處理複雜的時間關係</w:t>
       </w:r>
     </w:p>
     <w:p/>
@@ -1428,32 +2062,320 @@
         <w:rPr>
           <w:rFonts w:hint="eastAsia"/>
         </w:rPr>
-        <w:t>數量龐大，而且單份文件篇幅冗長</w:t>
-      </w:r>
-    </w:p>
-    <w:p>
-      <w:pPr>
-        <w:rPr>
-          <w:rFonts w:hint="eastAsia"/>
-        </w:rPr>
-      </w:pPr>
-      <w:r>
-        <w:rPr>
-          <w:rFonts w:hint="eastAsia"/>
-        </w:rPr>
-        <w:t>奏折和上諭難以研究，首先是因為數量十分龐大。清代不同時期、不同地區和不同官員留下了大量奏折、硃批和上諭，相關材料又分散在宮中檔案、軍機處檔案、《明清臺灣檔案彙編》、《天地會》、方略和地方志等不同編纂本中。王劍指出，隨著大量原本收藏於宮中的奏折逐步公開，奏折才逐漸成為清代社會史和政治史的重要研究材料。（王劍，〈近</w:t>
-      </w:r>
-      <w:r>
-        <w:rPr>
-          <w:rFonts w:hint="eastAsia"/>
-        </w:rPr>
-        <w:t>50</w:t>
-      </w:r>
-      <w:r>
-        <w:rPr>
-          <w:rFonts w:hint="eastAsia"/>
-        </w:rPr>
-        <w:t>年來清代奏折制度研究綜述〉，《中國史研究動態》，</w:t>
+        <w:t>單靠逐篇閱讀，很難同時掌握事件發生、奏折發出、皇帝收到、硃批形成、上諭發布和官員收到之間的先後次序。特別是在臺灣與內地之間，奏折和諭旨的往返可能需要一兩個月；皇帝收到的消息可能已經落後於戰場情勢，而官員收到上諭時，實際情況也可能已經改變。（李智君，〈清代大陸兵力對臺灣的跨海投送——以乾隆朝平定林爽文的戰爭為例〉，《南國學術》，</w:t>
+      </w:r>
+      <w:r>
+        <w:rPr>
+          <w:rFonts w:hint="eastAsia"/>
+        </w:rPr>
+        <w:t>2021</w:t>
+      </w:r>
+      <w:r>
+        <w:rPr>
+          <w:rFonts w:hint="eastAsia"/>
+        </w:rPr>
+        <w:t>年第</w:t>
+      </w:r>
+      <w:r>
+        <w:rPr>
+          <w:rFonts w:hint="eastAsia"/>
+        </w:rPr>
+        <w:t>1</w:t>
+      </w:r>
+      <w:r>
+        <w:rPr>
+          <w:rFonts w:hint="eastAsia"/>
+        </w:rPr>
+        <w:t>期，頁碼待核。）</w:t>
+      </w:r>
+    </w:p>
+    <w:p/>
+    <w:p>
+      <w:pPr>
+        <w:rPr>
+          <w:rFonts w:hint="eastAsia"/>
+        </w:rPr>
+      </w:pPr>
+      <w:r>
+        <w:rPr>
+          <w:rFonts w:hint="eastAsia"/>
+        </w:rPr>
+        <w:t>因此，網站首先以時間線整理不同類型的日期：</w:t>
+      </w:r>
+    </w:p>
+    <w:p/>
+    <w:p>
+      <w:pPr>
+        <w:rPr>
+          <w:rFonts w:hint="eastAsia"/>
+        </w:rPr>
+      </w:pPr>
+      <w:r>
+        <w:rPr>
+          <w:rFonts w:hint="eastAsia"/>
+        </w:rPr>
+        <w:t>`</w:t>
+      </w:r>
+      <w:r>
+        <w:rPr>
+          <w:rFonts w:hint="eastAsia"/>
+        </w:rPr>
+        <w:t>事件發生</w:t>
+      </w:r>
+      <w:r>
+        <w:rPr>
+          <w:rFonts w:hint="eastAsia"/>
+        </w:rPr>
+        <w:t xml:space="preserve"> </w:t>
+      </w:r>
+      <w:r>
+        <w:rPr>
+          <w:rFonts w:hint="eastAsia"/>
+        </w:rPr>
+        <w:t>→</w:t>
+      </w:r>
+      <w:r>
+        <w:rPr>
+          <w:rFonts w:hint="eastAsia"/>
+        </w:rPr>
+        <w:t xml:space="preserve"> </w:t>
+      </w:r>
+      <w:r>
+        <w:rPr>
+          <w:rFonts w:hint="eastAsia"/>
+        </w:rPr>
+        <w:t>奏折發出</w:t>
+      </w:r>
+      <w:r>
+        <w:rPr>
+          <w:rFonts w:hint="eastAsia"/>
+        </w:rPr>
+        <w:t xml:space="preserve"> </w:t>
+      </w:r>
+      <w:r>
+        <w:rPr>
+          <w:rFonts w:hint="eastAsia"/>
+        </w:rPr>
+        <w:t>→</w:t>
+      </w:r>
+      <w:r>
+        <w:rPr>
+          <w:rFonts w:hint="eastAsia"/>
+        </w:rPr>
+        <w:t xml:space="preserve"> </w:t>
+      </w:r>
+      <w:r>
+        <w:rPr>
+          <w:rFonts w:hint="eastAsia"/>
+        </w:rPr>
+        <w:t>皇帝收到／硃批</w:t>
+      </w:r>
+      <w:r>
+        <w:rPr>
+          <w:rFonts w:hint="eastAsia"/>
+        </w:rPr>
+        <w:t xml:space="preserve"> </w:t>
+      </w:r>
+      <w:r>
+        <w:rPr>
+          <w:rFonts w:hint="eastAsia"/>
+        </w:rPr>
+        <w:t>→</w:t>
+      </w:r>
+      <w:r>
+        <w:rPr>
+          <w:rFonts w:hint="eastAsia"/>
+        </w:rPr>
+        <w:t xml:space="preserve"> </w:t>
+      </w:r>
+      <w:r>
+        <w:rPr>
+          <w:rFonts w:hint="eastAsia"/>
+        </w:rPr>
+        <w:t>上諭發布</w:t>
+      </w:r>
+      <w:r>
+        <w:rPr>
+          <w:rFonts w:hint="eastAsia"/>
+        </w:rPr>
+        <w:t xml:space="preserve"> </w:t>
+      </w:r>
+      <w:r>
+        <w:rPr>
+          <w:rFonts w:hint="eastAsia"/>
+        </w:rPr>
+        <w:t>→</w:t>
+      </w:r>
+      <w:r>
+        <w:rPr>
+          <w:rFonts w:hint="eastAsia"/>
+        </w:rPr>
+        <w:t xml:space="preserve"> </w:t>
+      </w:r>
+      <w:r>
+        <w:rPr>
+          <w:rFonts w:hint="eastAsia"/>
+        </w:rPr>
+        <w:t>官員收到或採取行動</w:t>
+      </w:r>
+      <w:r>
+        <w:rPr>
+          <w:rFonts w:hint="eastAsia"/>
+        </w:rPr>
+        <w:t>`</w:t>
+      </w:r>
+    </w:p>
+    <w:p/>
+    <w:p>
+      <w:pPr>
+        <w:rPr>
+          <w:rFonts w:hint="eastAsia"/>
+        </w:rPr>
+      </w:pPr>
+      <w:r>
+        <w:rPr>
+          <w:rFonts w:hint="eastAsia"/>
+        </w:rPr>
+        <w:t>已經由原文直接確認的日期，可以使用實心點和實線；由正文推算的日期則使用虛線或「推算」標籤；缺失日期則保留空白。這樣可以避免研究者把推測日期誤當成確定日期。</w:t>
+      </w:r>
+    </w:p>
+    <w:p/>
+    <w:p>
+      <w:pPr>
+        <w:rPr>
+          <w:rFonts w:hint="eastAsia"/>
+        </w:rPr>
+      </w:pPr>
+      <w:r>
+        <w:rPr>
+          <w:rFonts w:hint="eastAsia"/>
+        </w:rPr>
+        <w:lastRenderedPageBreak/>
+        <w:t>除了時間線，網站也使用四條關係分道，把文件、事件、命令和行動放在可以互相對照的視覺結構中。四條分道應按照系統實際的欄位和標籤顯示，不由介紹網站自行重新命名。使用者可以從某一份奏折或上諭向前追蹤來源，向後查看回應和行動，並觀察不同時間點之間是否存在延遲、重複報告或未完成的通信關係。</w:t>
+      </w:r>
+    </w:p>
+    <w:p/>
+    <w:p>
+      <w:pPr>
+        <w:rPr>
+          <w:rFonts w:hint="eastAsia"/>
+        </w:rPr>
+      </w:pPr>
+      <w:r>
+        <w:rPr>
+          <w:rFonts w:hint="eastAsia"/>
+        </w:rPr>
+        <w:t>這種設計的重點不是把歷史簡化成圖表，而是讓研究者可以同時看見：</w:t>
+      </w:r>
+    </w:p>
+    <w:p/>
+    <w:p>
+      <w:pPr>
+        <w:rPr>
+          <w:rFonts w:hint="eastAsia"/>
+        </w:rPr>
+      </w:pPr>
+      <w:r>
+        <w:rPr>
+          <w:rFonts w:hint="eastAsia"/>
+        </w:rPr>
+        <w:t xml:space="preserve">- </w:t>
+      </w:r>
+      <w:r>
+        <w:rPr>
+          <w:rFonts w:hint="eastAsia"/>
+        </w:rPr>
+        <w:t>事件何時發生；</w:t>
+      </w:r>
+    </w:p>
+    <w:p>
+      <w:pPr>
+        <w:rPr>
+          <w:rFonts w:hint="eastAsia"/>
+        </w:rPr>
+      </w:pPr>
+      <w:r>
+        <w:rPr>
+          <w:rFonts w:hint="eastAsia"/>
+        </w:rPr>
+        <w:t xml:space="preserve">- </w:t>
+      </w:r>
+      <w:r>
+        <w:rPr>
+          <w:rFonts w:hint="eastAsia"/>
+        </w:rPr>
+        <w:t>文書何時發出和收到；</w:t>
+      </w:r>
+    </w:p>
+    <w:p>
+      <w:pPr>
+        <w:rPr>
+          <w:rFonts w:hint="eastAsia"/>
+        </w:rPr>
+      </w:pPr>
+      <w:r>
+        <w:rPr>
+          <w:rFonts w:hint="eastAsia"/>
+        </w:rPr>
+        <w:t xml:space="preserve">- </w:t>
+      </w:r>
+      <w:r>
+        <w:rPr>
+          <w:rFonts w:hint="eastAsia"/>
+        </w:rPr>
+        <w:t>哪些文件可能互相回應；</w:t>
+      </w:r>
+    </w:p>
+    <w:p>
+      <w:pPr>
+        <w:rPr>
+          <w:rFonts w:hint="eastAsia"/>
+        </w:rPr>
+      </w:pPr>
+      <w:r>
+        <w:rPr>
+          <w:rFonts w:hint="eastAsia"/>
+        </w:rPr>
+        <w:t xml:space="preserve">- </w:t>
+      </w:r>
+      <w:r>
+        <w:rPr>
+          <w:rFonts w:hint="eastAsia"/>
+        </w:rPr>
+        <w:t>哪些命令被執行或再次報告；</w:t>
+      </w:r>
+    </w:p>
+    <w:p>
+      <w:pPr>
+        <w:rPr>
+          <w:rFonts w:hint="eastAsia"/>
+        </w:rPr>
+      </w:pPr>
+      <w:r>
+        <w:rPr>
+          <w:rFonts w:hint="eastAsia"/>
+        </w:rPr>
+        <w:t xml:space="preserve">- </w:t>
+      </w:r>
+      <w:r>
+        <w:rPr>
+          <w:rFonts w:hint="eastAsia"/>
+        </w:rPr>
+        <w:t>哪些關係仍然缺乏足夠證據。</w:t>
+      </w:r>
+    </w:p>
+    <w:p/>
+    <w:p>
+      <w:pPr>
+        <w:rPr>
+          <w:rFonts w:hint="eastAsia"/>
+        </w:rPr>
+      </w:pPr>
+      <w:r>
+        <w:rPr>
+          <w:rFonts w:hint="eastAsia"/>
+        </w:rPr>
+        <w:t>驛傳材料指出，清代的驛站、遞鋪、臺站和軍臺組成了傳遞奏折、上諭和軍報的官方資訊網絡，但道路、海峽、戰場和地方執行能力仍會造成延遲。因此，時間線和關係圖表可以幫助研究者把文書制度、交通條件和政治決策放在同一個分析框架中。（劉文鵬，《清代驛傳及其與疆域形成關係之研究》，北京：中國人民大學出版社，</w:t>
       </w:r>
       <w:r>
         <w:rPr>
@@ -1465,114 +2387,39 @@
         <w:rPr>
           <w:rFonts w:hint="eastAsia"/>
         </w:rPr>
-        <w:t>年第</w:t>
-      </w:r>
-      <w:r>
-        <w:rPr>
-          <w:rFonts w:hint="eastAsia"/>
-        </w:rPr>
-        <w:t>7</w:t>
-      </w:r>
-      <w:r>
-        <w:rPr>
-          <w:rFonts w:hint="eastAsia"/>
-        </w:rPr>
-        <w:t>期，頁</w:t>
-      </w:r>
-      <w:r>
-        <w:rPr>
-          <w:rFonts w:hint="eastAsia"/>
-        </w:rPr>
-        <w:t>20</w:t>
-      </w:r>
-      <w:r>
-        <w:rPr>
-          <w:rFonts w:hint="eastAsia"/>
-        </w:rPr>
-        <w:t>–</w:t>
-      </w:r>
-      <w:r>
-        <w:rPr>
-          <w:rFonts w:hint="eastAsia"/>
-        </w:rPr>
-        <w:t>21</w:t>
-      </w:r>
-      <w:r>
-        <w:rPr>
-          <w:rFonts w:hint="eastAsia"/>
-        </w:rPr>
-        <w:t>。）</w:t>
-      </w:r>
-    </w:p>
-    <w:p>
-      <w:pPr>
-        <w:rPr>
-          <w:rFonts w:hint="eastAsia"/>
-        </w:rPr>
-      </w:pPr>
-      <w:r>
-        <w:rPr>
-          <w:rFonts w:hint="eastAsia"/>
-        </w:rPr>
-        <w:t>本專案所整理的林爽文事件相關語料，已包含超過一千八百份結構化文書，涵蓋上奏、硃批、上諭、移咨和其他文書類型。這些文件不只數量多，而且分散在不同官員、不同地點和不同時間之中。研究者若只閱讀單一官員或單一文書集，可能只能看到通信網絡的一部分，難以重建地方與中央之間完整的資訊流動。（本專案〈林爽文</w:t>
-      </w:r>
-      <w:r>
-        <w:rPr>
-          <w:rFonts w:hint="eastAsia"/>
-        </w:rPr>
-        <w:t xml:space="preserve"> First-Hand Corpus</w:t>
-      </w:r>
-      <w:r>
-        <w:rPr>
-          <w:rFonts w:hint="eastAsia"/>
-        </w:rPr>
-        <w:t>〉資料說明，</w:t>
-      </w:r>
-      <w:r>
-        <w:rPr>
-          <w:rFonts w:hint="eastAsia"/>
-        </w:rPr>
-        <w:t>2026</w:t>
-      </w:r>
-      <w:r>
-        <w:rPr>
-          <w:rFonts w:hint="eastAsia"/>
-        </w:rPr>
-        <w:t>年，頁碼不適用。）</w:t>
-      </w:r>
-    </w:p>
-    <w:p>
-      <w:pPr>
-        <w:rPr>
-          <w:rFonts w:hint="eastAsia"/>
-        </w:rPr>
-      </w:pPr>
-      <w:r>
-        <w:rPr>
-          <w:rFonts w:hint="eastAsia"/>
-        </w:rPr>
-        <w:t>其次，單份奏折或上諭本身也可能十分冗長。一份奏折往往同時包含多項事件、不同日期、人物關係、地點、軍事行動、糧餉問題和官員請求；一份上諭則可能同時回應多名官員、處理多個政務，並引用較早的奏報或上諭。</w:t>
-      </w:r>
-    </w:p>
-    <w:p>
-      <w:pPr>
-        <w:rPr>
-          <w:rFonts w:hint="eastAsia"/>
-        </w:rPr>
-      </w:pPr>
-      <w:r>
-        <w:rPr>
-          <w:rFonts w:hint="eastAsia"/>
-        </w:rPr>
-        <w:t>長篇文書也經常把「前線發生的事件」、「官員自己的行動」、「其他人的報告」和「對皇帝的請求」寫在同一篇正文中。真正重要的資訊可能只分散在數個段落，例如一個日期、一句「奉到上諭」的記錄，或一段說明某項命令如何被執行的回奏。若只閱讀摘要，可能遺漏原文中的時間、語氣和文書關係；但若逐字閱讀大量長篇文件，又需要投入非常多時間。</w:t>
-      </w:r>
-    </w:p>
-    <w:p>
-      <w:r>
-        <w:rPr>
-          <w:rFonts w:hint="eastAsia"/>
-        </w:rPr>
-        <w:t>因此，研究困難不只是「資料太多」，也是「每一份資料都包含許多需要分開判讀的內容」。研究者必須把長篇文書拆分為事件、日期、人物、地點、行動、引文和文書關係，再將每項資訊放回完整原文核對。這正是本網站使用</w:t>
+        <w:t>年，頁碼待核；張正樺，〈清乾隆朝驛傳制度之研究〉，國立臺灣師範大學歷史學系碩士論文，</w:t>
+      </w:r>
+      <w:r>
+        <w:rPr>
+          <w:rFonts w:hint="eastAsia"/>
+        </w:rPr>
+        <w:t>2008</w:t>
+      </w:r>
+      <w:r>
+        <w:rPr>
+          <w:rFonts w:hint="eastAsia"/>
+        </w:rPr>
+        <w:t>年，頁碼待核。）</w:t>
+      </w:r>
+    </w:p>
+    <w:p/>
+    <w:p>
+      <w:pPr>
+        <w:rPr>
+          <w:rFonts w:hint="eastAsia"/>
+        </w:rPr>
+      </w:pPr>
+      <w:r>
+        <w:rPr>
+          <w:rFonts w:hint="eastAsia"/>
+        </w:rPr>
+        <w:t xml:space="preserve">#### </w:t>
+      </w:r>
+      <w:r>
+        <w:rPr>
+          <w:rFonts w:hint="eastAsia"/>
+        </w:rPr>
+        <w:t>二、以</w:t>
       </w:r>
       <w:r>
         <w:rPr>
@@ -1584,519 +2431,6 @@
         <w:rPr>
           <w:rFonts w:hint="eastAsia"/>
         </w:rPr>
-        <w:t>協助初步整理和視覺化的原因；但</w:t>
-      </w:r>
-      <w:r>
-        <w:rPr>
-          <w:rFonts w:hint="eastAsia"/>
-        </w:rPr>
-        <w:t xml:space="preserve"> AI </w:t>
-      </w:r>
-      <w:r>
-        <w:rPr>
-          <w:rFonts w:hint="eastAsia"/>
-        </w:rPr>
-        <w:t>的摘要不能取代研究者對全文脈絡和史料證據的判斷。</w:t>
-      </w:r>
-    </w:p>
-    <w:p>
-      <w:pPr>
-        <w:rPr>
-          <w:rFonts w:hint="eastAsia"/>
-        </w:rPr>
-      </w:pPr>
-      <w:r>
-        <w:rPr>
-          <w:rFonts w:hint="eastAsia"/>
-        </w:rPr>
-        <w:lastRenderedPageBreak/>
-        <w:t>奏折、硃批和上諭的另一個研究困難，是單份文件往往十分冗長，且真正重要的內容不一定直接出現在開頭。尤其當一份奏折是為了回應先前的上諭時，官員常會先完整或大段引用收到的上諭，接著才寫出自己的實際回應。</w:t>
-      </w:r>
-    </w:p>
-    <w:p>
-      <w:pPr>
-        <w:rPr>
-          <w:rFonts w:hint="eastAsia"/>
-        </w:rPr>
-      </w:pPr>
-      <w:r>
-        <w:rPr>
-          <w:rFonts w:hint="eastAsia"/>
-        </w:rPr>
-        <w:t>因此，一份奏折可能先花很長篇幅重述皇帝的命令，然後才說明地方官員已經完成甚麼、目前遇到甚麼困難，或下一步準備如何處理。研究者如果沒有區分「被引用的上諭」和「官員自己的回應」，便可能把皇帝的命令誤當成官員的行動，或把同一段內容重複計算為兩次事件。</w:t>
-      </w:r>
-    </w:p>
-    <w:p>
-      <w:r>
-        <w:rPr>
-          <w:rFonts w:hint="eastAsia"/>
-        </w:rPr>
-        <w:t>此外，奏折和硃批中也包含大量固定的官場套語，例如請安、謝恩、稱頌皇恩、表達惶恐、宣示遵旨和結尾的謹奏格式。這些文字對理解清代政治禮儀和官僚文化十分重要，但不一定直接提供研究者要找的戰況、日期或行動資訊。真正的研究證據可能只出現在套語之間的一小段文字中。</w:t>
-      </w:r>
-    </w:p>
-    <w:p>
-      <w:r>
-        <w:br w:type="page"/>
-      </w:r>
-    </w:p>
-    <w:p>
-      <w:pPr>
-        <w:rPr>
-          <w:rFonts w:hint="eastAsia"/>
-        </w:rPr>
-      </w:pPr>
-      <w:r>
-        <w:rPr>
-          <w:rFonts w:hint="eastAsia"/>
-        </w:rPr>
-        <w:lastRenderedPageBreak/>
-        <w:t xml:space="preserve">### </w:t>
-      </w:r>
-      <w:r>
-        <w:rPr>
-          <w:rFonts w:hint="eastAsia"/>
-        </w:rPr>
-        <w:t>為甚麼需要數位人文和</w:t>
-      </w:r>
-      <w:r>
-        <w:rPr>
-          <w:rFonts w:hint="eastAsia"/>
-        </w:rPr>
-        <w:t xml:space="preserve"> AI</w:t>
-      </w:r>
-      <w:r>
-        <w:rPr>
-          <w:rFonts w:hint="eastAsia"/>
-        </w:rPr>
-        <w:t>？</w:t>
-      </w:r>
-    </w:p>
-    <w:p/>
-    <w:p>
-      <w:pPr>
-        <w:rPr>
-          <w:rFonts w:hint="eastAsia"/>
-        </w:rPr>
-      </w:pPr>
-      <w:r>
-        <w:rPr>
-          <w:rFonts w:hint="eastAsia"/>
-        </w:rPr>
-        <w:t>奏折、硃批與上諭的兩個主要研究困難，是資料數量龐大而且篇幅冗長，以及文件之間存在複雜的時間和通信關係。數位人文和</w:t>
-      </w:r>
-      <w:r>
-        <w:rPr>
-          <w:rFonts w:hint="eastAsia"/>
-        </w:rPr>
-        <w:t xml:space="preserve"> AI </w:t>
-      </w:r>
-      <w:r>
-        <w:rPr>
-          <w:rFonts w:hint="eastAsia"/>
-        </w:rPr>
-        <w:t>的作用，正是把這兩種困難轉化為可以整理、比較和核對的研究流程。</w:t>
-      </w:r>
-    </w:p>
-    <w:p/>
-    <w:p>
-      <w:pPr>
-        <w:rPr>
-          <w:rFonts w:hint="eastAsia"/>
-        </w:rPr>
-      </w:pPr>
-      <w:r>
-        <w:rPr>
-          <w:rFonts w:hint="eastAsia"/>
-        </w:rPr>
-        <w:t xml:space="preserve">#### </w:t>
-      </w:r>
-      <w:r>
-        <w:rPr>
-          <w:rFonts w:hint="eastAsia"/>
-        </w:rPr>
-        <w:t>一、以時間線和四條關係分道處理複雜的時間關係</w:t>
-      </w:r>
-    </w:p>
-    <w:p/>
-    <w:p>
-      <w:pPr>
-        <w:rPr>
-          <w:rFonts w:hint="eastAsia"/>
-        </w:rPr>
-      </w:pPr>
-      <w:r>
-        <w:rPr>
-          <w:rFonts w:hint="eastAsia"/>
-        </w:rPr>
-        <w:t>單靠逐篇閱讀，很難同時掌握事件發生、奏折發出、皇帝收到、硃批形成、上諭發布和官員收到之間的先後次序。特別是在臺灣與內地之間，奏折和諭旨的往返可能需要一兩個月；皇帝收到的消息可能已經落後於戰場情勢，而官員收到上諭時，實際情況也可能已經改變。（李智君，〈清代大陸兵力對臺灣的跨海投送——以乾隆朝平定林爽文的戰爭為例〉，《南國學術》，</w:t>
-      </w:r>
-      <w:r>
-        <w:rPr>
-          <w:rFonts w:hint="eastAsia"/>
-        </w:rPr>
-        <w:t>2021</w:t>
-      </w:r>
-      <w:r>
-        <w:rPr>
-          <w:rFonts w:hint="eastAsia"/>
-        </w:rPr>
-        <w:t>年第</w:t>
-      </w:r>
-      <w:r>
-        <w:rPr>
-          <w:rFonts w:hint="eastAsia"/>
-        </w:rPr>
-        <w:t>1</w:t>
-      </w:r>
-      <w:r>
-        <w:rPr>
-          <w:rFonts w:hint="eastAsia"/>
-        </w:rPr>
-        <w:t>期，頁碼待核。）</w:t>
-      </w:r>
-    </w:p>
-    <w:p/>
-    <w:p>
-      <w:pPr>
-        <w:rPr>
-          <w:rFonts w:hint="eastAsia"/>
-        </w:rPr>
-      </w:pPr>
-      <w:r>
-        <w:rPr>
-          <w:rFonts w:hint="eastAsia"/>
-        </w:rPr>
-        <w:t>因此，網站首先以時間線整理不同類型的日期：</w:t>
-      </w:r>
-    </w:p>
-    <w:p/>
-    <w:p>
-      <w:pPr>
-        <w:rPr>
-          <w:rFonts w:hint="eastAsia"/>
-        </w:rPr>
-      </w:pPr>
-      <w:r>
-        <w:rPr>
-          <w:rFonts w:hint="eastAsia"/>
-        </w:rPr>
-        <w:t>`</w:t>
-      </w:r>
-      <w:r>
-        <w:rPr>
-          <w:rFonts w:hint="eastAsia"/>
-        </w:rPr>
-        <w:t>事件發生</w:t>
-      </w:r>
-      <w:r>
-        <w:rPr>
-          <w:rFonts w:hint="eastAsia"/>
-        </w:rPr>
-        <w:t xml:space="preserve"> </w:t>
-      </w:r>
-      <w:r>
-        <w:rPr>
-          <w:rFonts w:hint="eastAsia"/>
-        </w:rPr>
-        <w:t>→</w:t>
-      </w:r>
-      <w:r>
-        <w:rPr>
-          <w:rFonts w:hint="eastAsia"/>
-        </w:rPr>
-        <w:t xml:space="preserve"> </w:t>
-      </w:r>
-      <w:r>
-        <w:rPr>
-          <w:rFonts w:hint="eastAsia"/>
-        </w:rPr>
-        <w:t>奏折發出</w:t>
-      </w:r>
-      <w:r>
-        <w:rPr>
-          <w:rFonts w:hint="eastAsia"/>
-        </w:rPr>
-        <w:t xml:space="preserve"> </w:t>
-      </w:r>
-      <w:r>
-        <w:rPr>
-          <w:rFonts w:hint="eastAsia"/>
-        </w:rPr>
-        <w:t>→</w:t>
-      </w:r>
-      <w:r>
-        <w:rPr>
-          <w:rFonts w:hint="eastAsia"/>
-        </w:rPr>
-        <w:t xml:space="preserve"> </w:t>
-      </w:r>
-      <w:r>
-        <w:rPr>
-          <w:rFonts w:hint="eastAsia"/>
-        </w:rPr>
-        <w:t>皇帝收到／硃批</w:t>
-      </w:r>
-      <w:r>
-        <w:rPr>
-          <w:rFonts w:hint="eastAsia"/>
-        </w:rPr>
-        <w:t xml:space="preserve"> </w:t>
-      </w:r>
-      <w:r>
-        <w:rPr>
-          <w:rFonts w:hint="eastAsia"/>
-        </w:rPr>
-        <w:t>→</w:t>
-      </w:r>
-      <w:r>
-        <w:rPr>
-          <w:rFonts w:hint="eastAsia"/>
-        </w:rPr>
-        <w:t xml:space="preserve"> </w:t>
-      </w:r>
-      <w:r>
-        <w:rPr>
-          <w:rFonts w:hint="eastAsia"/>
-        </w:rPr>
-        <w:t>上諭發布</w:t>
-      </w:r>
-      <w:r>
-        <w:rPr>
-          <w:rFonts w:hint="eastAsia"/>
-        </w:rPr>
-        <w:t xml:space="preserve"> </w:t>
-      </w:r>
-      <w:r>
-        <w:rPr>
-          <w:rFonts w:hint="eastAsia"/>
-        </w:rPr>
-        <w:t>→</w:t>
-      </w:r>
-      <w:r>
-        <w:rPr>
-          <w:rFonts w:hint="eastAsia"/>
-        </w:rPr>
-        <w:t xml:space="preserve"> </w:t>
-      </w:r>
-      <w:r>
-        <w:rPr>
-          <w:rFonts w:hint="eastAsia"/>
-        </w:rPr>
-        <w:t>官員收到或採取行動</w:t>
-      </w:r>
-      <w:r>
-        <w:rPr>
-          <w:rFonts w:hint="eastAsia"/>
-        </w:rPr>
-        <w:t>`</w:t>
-      </w:r>
-    </w:p>
-    <w:p/>
-    <w:p>
-      <w:pPr>
-        <w:rPr>
-          <w:rFonts w:hint="eastAsia"/>
-        </w:rPr>
-      </w:pPr>
-      <w:r>
-        <w:rPr>
-          <w:rFonts w:hint="eastAsia"/>
-        </w:rPr>
-        <w:t>已經由原文直接確認的日期，可以使用實心點和實線；由正文推算的日期則使用虛線或「推算」標籤；缺失日期則保留空白。這樣可以避免研究者把推測日期誤當成確定日期。</w:t>
-      </w:r>
-    </w:p>
-    <w:p/>
-    <w:p>
-      <w:pPr>
-        <w:rPr>
-          <w:rFonts w:hint="eastAsia"/>
-        </w:rPr>
-      </w:pPr>
-      <w:r>
-        <w:rPr>
-          <w:rFonts w:hint="eastAsia"/>
-        </w:rPr>
-        <w:t>除了時間線，網站也使用四條關係分道，把文件、事件、命令和行動放在可以互相對照的視覺結構中。四條分道應按照系統實際的欄位和標籤顯示，不由介紹網站自行重新命名。使用者可以從某一份奏折或上諭向前追蹤來源，向後查看回應和行動，並觀察不同時間點之間是否存在延遲、重複報告或未完成的通信關係。</w:t>
-      </w:r>
-    </w:p>
-    <w:p/>
-    <w:p>
-      <w:pPr>
-        <w:rPr>
-          <w:rFonts w:hint="eastAsia"/>
-        </w:rPr>
-      </w:pPr>
-      <w:r>
-        <w:rPr>
-          <w:rFonts w:hint="eastAsia"/>
-        </w:rPr>
-        <w:t>這種設計的重點不是把歷史簡化成圖表，而是讓研究者可以同時看見：</w:t>
-      </w:r>
-    </w:p>
-    <w:p/>
-    <w:p>
-      <w:pPr>
-        <w:rPr>
-          <w:rFonts w:hint="eastAsia"/>
-        </w:rPr>
-      </w:pPr>
-      <w:r>
-        <w:rPr>
-          <w:rFonts w:hint="eastAsia"/>
-        </w:rPr>
-        <w:t xml:space="preserve">- </w:t>
-      </w:r>
-      <w:r>
-        <w:rPr>
-          <w:rFonts w:hint="eastAsia"/>
-        </w:rPr>
-        <w:t>事件何時發生；</w:t>
-      </w:r>
-    </w:p>
-    <w:p>
-      <w:pPr>
-        <w:rPr>
-          <w:rFonts w:hint="eastAsia"/>
-        </w:rPr>
-      </w:pPr>
-      <w:r>
-        <w:rPr>
-          <w:rFonts w:hint="eastAsia"/>
-        </w:rPr>
-        <w:lastRenderedPageBreak/>
-        <w:t xml:space="preserve">- </w:t>
-      </w:r>
-      <w:r>
-        <w:rPr>
-          <w:rFonts w:hint="eastAsia"/>
-        </w:rPr>
-        <w:t>文書何時發出和收到；</w:t>
-      </w:r>
-    </w:p>
-    <w:p>
-      <w:pPr>
-        <w:rPr>
-          <w:rFonts w:hint="eastAsia"/>
-        </w:rPr>
-      </w:pPr>
-      <w:r>
-        <w:rPr>
-          <w:rFonts w:hint="eastAsia"/>
-        </w:rPr>
-        <w:t xml:space="preserve">- </w:t>
-      </w:r>
-      <w:r>
-        <w:rPr>
-          <w:rFonts w:hint="eastAsia"/>
-        </w:rPr>
-        <w:t>哪些文件可能互相回應；</w:t>
-      </w:r>
-    </w:p>
-    <w:p>
-      <w:pPr>
-        <w:rPr>
-          <w:rFonts w:hint="eastAsia"/>
-        </w:rPr>
-      </w:pPr>
-      <w:r>
-        <w:rPr>
-          <w:rFonts w:hint="eastAsia"/>
-        </w:rPr>
-        <w:t xml:space="preserve">- </w:t>
-      </w:r>
-      <w:r>
-        <w:rPr>
-          <w:rFonts w:hint="eastAsia"/>
-        </w:rPr>
-        <w:t>哪些命令被執行或再次報告；</w:t>
-      </w:r>
-    </w:p>
-    <w:p>
-      <w:pPr>
-        <w:rPr>
-          <w:rFonts w:hint="eastAsia"/>
-        </w:rPr>
-      </w:pPr>
-      <w:r>
-        <w:rPr>
-          <w:rFonts w:hint="eastAsia"/>
-        </w:rPr>
-        <w:t xml:space="preserve">- </w:t>
-      </w:r>
-      <w:r>
-        <w:rPr>
-          <w:rFonts w:hint="eastAsia"/>
-        </w:rPr>
-        <w:t>哪些關係仍然缺乏足夠證據。</w:t>
-      </w:r>
-    </w:p>
-    <w:p/>
-    <w:p>
-      <w:pPr>
-        <w:rPr>
-          <w:rFonts w:hint="eastAsia"/>
-        </w:rPr>
-      </w:pPr>
-      <w:r>
-        <w:rPr>
-          <w:rFonts w:hint="eastAsia"/>
-        </w:rPr>
-        <w:t>驛傳材料指出，清代的驛站、遞鋪、臺站和軍臺組成了傳遞奏折、上諭和軍報的官方資訊網絡，但道路、海峽、戰場和地方執行能力仍會造成延遲。因此，時間線和關係圖表可以幫助研究者把文書制度、交通條件和政治決策放在同一個分析框架中。（劉文鵬，《清代驛傳及其與疆域形成關係之研究》，北京：中國人民大學出版社，</w:t>
-      </w:r>
-      <w:r>
-        <w:rPr>
-          <w:rFonts w:hint="eastAsia"/>
-        </w:rPr>
-        <w:t>2004</w:t>
-      </w:r>
-      <w:r>
-        <w:rPr>
-          <w:rFonts w:hint="eastAsia"/>
-        </w:rPr>
-        <w:t>年，頁碼待核；張正樺，〈清乾隆朝驛傳制度之研究〉，國立臺灣師範大學歷史學系碩士論文，</w:t>
-      </w:r>
-      <w:r>
-        <w:rPr>
-          <w:rFonts w:hint="eastAsia"/>
-        </w:rPr>
-        <w:t>2008</w:t>
-      </w:r>
-      <w:r>
-        <w:rPr>
-          <w:rFonts w:hint="eastAsia"/>
-        </w:rPr>
-        <w:t>年，頁碼待核。）</w:t>
-      </w:r>
-    </w:p>
-    <w:p/>
-    <w:p>
-      <w:pPr>
-        <w:rPr>
-          <w:rFonts w:hint="eastAsia"/>
-        </w:rPr>
-      </w:pPr>
-      <w:r>
-        <w:rPr>
-          <w:rFonts w:hint="eastAsia"/>
-        </w:rPr>
-        <w:t xml:space="preserve">#### </w:t>
-      </w:r>
-      <w:r>
-        <w:rPr>
-          <w:rFonts w:hint="eastAsia"/>
-        </w:rPr>
-        <w:t>二、以</w:t>
-      </w:r>
-      <w:r>
-        <w:rPr>
-          <w:rFonts w:hint="eastAsia"/>
-        </w:rPr>
-        <w:t xml:space="preserve"> AI </w:t>
-      </w:r>
-      <w:r>
-        <w:rPr>
-          <w:rFonts w:hint="eastAsia"/>
-        </w:rPr>
         <w:t>和</w:t>
       </w:r>
       <w:r>
@@ -2110,463 +2444,6 @@
           <w:rFonts w:hint="eastAsia"/>
         </w:rPr>
         <w:t>處理大量及冗長的原文</w:t>
-      </w:r>
-    </w:p>
-    <w:p/>
-    <w:p>
-      <w:pPr>
-        <w:rPr>
-          <w:rFonts w:hint="eastAsia"/>
-        </w:rPr>
-      </w:pPr>
-      <w:r>
-        <w:rPr>
-          <w:rFonts w:hint="eastAsia"/>
-        </w:rPr>
-        <w:t>時間線和關係圖表可以整理文件之間的結構，但不能單靠人工快速閱讀大量長篇奏折。</w:t>
-      </w:r>
-      <w:r>
-        <w:rPr>
-          <w:rFonts w:hint="eastAsia"/>
-        </w:rPr>
-        <w:t xml:space="preserve">AI </w:t>
-      </w:r>
-      <w:r>
-        <w:rPr>
-          <w:rFonts w:hint="eastAsia"/>
-        </w:rPr>
-        <w:t>的作用，是協助研究者從原文中提取指定資訊，再把結果整理成可以檢查的結構化資料。</w:t>
-      </w:r>
-    </w:p>
-    <w:p/>
-    <w:p>
-      <w:pPr>
-        <w:rPr>
-          <w:rFonts w:hint="eastAsia"/>
-        </w:rPr>
-      </w:pPr>
-      <w:r>
-        <w:rPr>
-          <w:rFonts w:hint="eastAsia"/>
-        </w:rPr>
-        <w:t>不過，</w:t>
-      </w:r>
-      <w:r>
-        <w:rPr>
-          <w:rFonts w:hint="eastAsia"/>
-        </w:rPr>
-        <w:t xml:space="preserve">AI </w:t>
-      </w:r>
-      <w:r>
-        <w:rPr>
-          <w:rFonts w:hint="eastAsia"/>
-        </w:rPr>
-        <w:t>不應只被要求「總結這份奏折」。本網站使用的方式，是為不同研究問題設計不同的</w:t>
-      </w:r>
-      <w:r>
-        <w:rPr>
-          <w:rFonts w:hint="eastAsia"/>
-        </w:rPr>
-        <w:t xml:space="preserve"> skills</w:t>
-      </w:r>
-      <w:r>
-        <w:rPr>
-          <w:rFonts w:hint="eastAsia"/>
-        </w:rPr>
-        <w:t>。每一個</w:t>
-      </w:r>
-      <w:r>
-        <w:rPr>
-          <w:rFonts w:hint="eastAsia"/>
-        </w:rPr>
-        <w:t xml:space="preserve"> skill </w:t>
-      </w:r>
-      <w:r>
-        <w:rPr>
-          <w:rFonts w:hint="eastAsia"/>
-        </w:rPr>
-        <w:t>都要明確說明：</w:t>
-      </w:r>
-    </w:p>
-    <w:p/>
-    <w:p>
-      <w:pPr>
-        <w:rPr>
-          <w:rFonts w:hint="eastAsia"/>
-        </w:rPr>
-      </w:pPr>
-      <w:r>
-        <w:rPr>
-          <w:rFonts w:hint="eastAsia"/>
-        </w:rPr>
-        <w:t xml:space="preserve">- </w:t>
-      </w:r>
-      <w:r>
-        <w:rPr>
-          <w:rFonts w:hint="eastAsia"/>
-        </w:rPr>
-        <w:t>要從原文尋找甚麼；</w:t>
-      </w:r>
-    </w:p>
-    <w:p>
-      <w:pPr>
-        <w:rPr>
-          <w:rFonts w:hint="eastAsia"/>
-        </w:rPr>
-      </w:pPr>
-      <w:r>
-        <w:rPr>
-          <w:rFonts w:hint="eastAsia"/>
-        </w:rPr>
-        <w:t xml:space="preserve">- </w:t>
-      </w:r>
-      <w:r>
-        <w:rPr>
-          <w:rFonts w:hint="eastAsia"/>
-        </w:rPr>
-        <w:t>哪些段落屬於引用的上諭；</w:t>
-      </w:r>
-    </w:p>
-    <w:p>
-      <w:pPr>
-        <w:rPr>
-          <w:rFonts w:hint="eastAsia"/>
-        </w:rPr>
-      </w:pPr>
-      <w:r>
-        <w:rPr>
-          <w:rFonts w:hint="eastAsia"/>
-        </w:rPr>
-        <w:t xml:space="preserve">- </w:t>
-      </w:r>
-      <w:r>
-        <w:rPr>
-          <w:rFonts w:hint="eastAsia"/>
-        </w:rPr>
-        <w:t>哪些內容是官員自己的回應；</w:t>
-      </w:r>
-    </w:p>
-    <w:p>
-      <w:pPr>
-        <w:rPr>
-          <w:rFonts w:hint="eastAsia"/>
-        </w:rPr>
-      </w:pPr>
-      <w:r>
-        <w:rPr>
-          <w:rFonts w:hint="eastAsia"/>
-        </w:rPr>
-        <w:t xml:space="preserve">- </w:t>
-      </w:r>
-      <w:r>
-        <w:rPr>
-          <w:rFonts w:hint="eastAsia"/>
-        </w:rPr>
-        <w:t>需要提取哪些日期、人物、地點和行動；</w:t>
-      </w:r>
-    </w:p>
-    <w:p>
-      <w:pPr>
-        <w:rPr>
-          <w:rFonts w:hint="eastAsia"/>
-        </w:rPr>
-      </w:pPr>
-      <w:r>
-        <w:rPr>
-          <w:rFonts w:hint="eastAsia"/>
-        </w:rPr>
-        <w:t xml:space="preserve">- </w:t>
-      </w:r>
-      <w:r>
-        <w:rPr>
-          <w:rFonts w:hint="eastAsia"/>
-        </w:rPr>
-        <w:t>哪些原文引句必須保留；</w:t>
-      </w:r>
-    </w:p>
-    <w:p>
-      <w:pPr>
-        <w:rPr>
-          <w:rFonts w:hint="eastAsia"/>
-        </w:rPr>
-      </w:pPr>
-      <w:r>
-        <w:rPr>
-          <w:rFonts w:hint="eastAsia"/>
-        </w:rPr>
-        <w:t xml:space="preserve">- </w:t>
-      </w:r>
-      <w:r>
-        <w:rPr>
-          <w:rFonts w:hint="eastAsia"/>
-        </w:rPr>
-        <w:t>資訊如何放入固定的</w:t>
-      </w:r>
-      <w:r>
-        <w:rPr>
-          <w:rFonts w:hint="eastAsia"/>
-        </w:rPr>
-        <w:t xml:space="preserve"> JSON </w:t>
-      </w:r>
-      <w:r>
-        <w:rPr>
-          <w:rFonts w:hint="eastAsia"/>
-        </w:rPr>
-        <w:t>欄位；</w:t>
-      </w:r>
-    </w:p>
-    <w:p>
-      <w:pPr>
-        <w:rPr>
-          <w:rFonts w:hint="eastAsia"/>
-        </w:rPr>
-      </w:pPr>
-      <w:r>
-        <w:rPr>
-          <w:rFonts w:hint="eastAsia"/>
-        </w:rPr>
-        <w:t xml:space="preserve">- </w:t>
-      </w:r>
-      <w:r>
-        <w:rPr>
-          <w:rFonts w:hint="eastAsia"/>
-        </w:rPr>
-        <w:t>沒有證據時應如何標示「未明」或「不足」；</w:t>
-      </w:r>
-    </w:p>
-    <w:p>
-      <w:pPr>
-        <w:rPr>
-          <w:rFonts w:hint="eastAsia"/>
-        </w:rPr>
-      </w:pPr>
-      <w:r>
-        <w:rPr>
-          <w:rFonts w:hint="eastAsia"/>
-        </w:rPr>
-        <w:t xml:space="preserve">- AI </w:t>
-      </w:r>
-      <w:r>
-        <w:rPr>
-          <w:rFonts w:hint="eastAsia"/>
-        </w:rPr>
-        <w:t>不可以自行補充或創造哪些內容。</w:t>
-      </w:r>
-    </w:p>
-    <w:p/>
-    <w:p>
-      <w:pPr>
-        <w:rPr>
-          <w:rFonts w:hint="eastAsia"/>
-        </w:rPr>
-      </w:pPr>
-      <w:r>
-        <w:rPr>
-          <w:rFonts w:hint="eastAsia"/>
-        </w:rPr>
-        <w:t>例如，一個</w:t>
-      </w:r>
-      <w:r>
-        <w:rPr>
-          <w:rFonts w:hint="eastAsia"/>
-        </w:rPr>
-        <w:t xml:space="preserve"> skill </w:t>
-      </w:r>
-      <w:r>
-        <w:rPr>
-          <w:rFonts w:hint="eastAsia"/>
-        </w:rPr>
-        <w:t>可以專門抽取奏折中的戰場事件，另一個</w:t>
-      </w:r>
-      <w:r>
-        <w:rPr>
-          <w:rFonts w:hint="eastAsia"/>
-        </w:rPr>
-        <w:t xml:space="preserve"> skill </w:t>
-      </w:r>
-      <w:r>
-        <w:rPr>
-          <w:rFonts w:hint="eastAsia"/>
-        </w:rPr>
-        <w:t>可以辨認皇帝在上諭中的命令，另一個</w:t>
-      </w:r>
-      <w:r>
-        <w:rPr>
-          <w:rFonts w:hint="eastAsia"/>
-        </w:rPr>
-        <w:t xml:space="preserve"> skill </w:t>
-      </w:r>
-      <w:r>
-        <w:rPr>
-          <w:rFonts w:hint="eastAsia"/>
-        </w:rPr>
-        <w:t>則可以判斷奏折是否回應先前的上諭。由於一份奏折可能同時包含長段上諭引文、官員回應和大量套語，</w:t>
-      </w:r>
-      <w:r>
-        <w:rPr>
-          <w:rFonts w:hint="eastAsia"/>
-        </w:rPr>
-        <w:t xml:space="preserve">AI </w:t>
-      </w:r>
-      <w:r>
-        <w:rPr>
-          <w:rFonts w:hint="eastAsia"/>
-        </w:rPr>
-        <w:t>需要先分段，再判斷每一段的說話者和功能，而不是把整份文件壓縮成一段摘要。</w:t>
-      </w:r>
-    </w:p>
-    <w:p/>
-    <w:p>
-      <w:pPr>
-        <w:rPr>
-          <w:rFonts w:hint="eastAsia"/>
-        </w:rPr>
-      </w:pPr>
-      <w:r>
-        <w:rPr>
-          <w:rFonts w:hint="eastAsia"/>
-        </w:rPr>
-        <w:t xml:space="preserve">AI </w:t>
-      </w:r>
-      <w:r>
-        <w:rPr>
-          <w:rFonts w:hint="eastAsia"/>
-        </w:rPr>
-        <w:t>輸出還需要保留原文引句、文件</w:t>
-      </w:r>
-      <w:r>
-        <w:rPr>
-          <w:rFonts w:hint="eastAsia"/>
-        </w:rPr>
-        <w:t xml:space="preserve"> ID</w:t>
-      </w:r>
-      <w:r>
-        <w:rPr>
-          <w:rFonts w:hint="eastAsia"/>
-        </w:rPr>
-        <w:t>、日期、來源、判斷理由和不確定性。這樣，研究者可以從</w:t>
-      </w:r>
-      <w:r>
-        <w:rPr>
-          <w:rFonts w:hint="eastAsia"/>
-        </w:rPr>
-        <w:t xml:space="preserve"> AI </w:t>
-      </w:r>
-      <w:r>
-        <w:rPr>
-          <w:rFonts w:hint="eastAsia"/>
-        </w:rPr>
-        <w:t>的結果回到完整奏折、硃批或上諭，確認</w:t>
-      </w:r>
-      <w:r>
-        <w:rPr>
-          <w:rFonts w:hint="eastAsia"/>
-        </w:rPr>
-        <w:t xml:space="preserve"> AI </w:t>
-      </w:r>
-      <w:r>
-        <w:rPr>
-          <w:rFonts w:hint="eastAsia"/>
-        </w:rPr>
-        <w:t>是否把皇帝的命令誤當成官員的行動，是否錯置了日期，或是否把相似事件誤判為回應關係。</w:t>
-      </w:r>
-    </w:p>
-    <w:p/>
-    <w:p>
-      <w:pPr>
-        <w:rPr>
-          <w:rFonts w:hint="eastAsia"/>
-        </w:rPr>
-      </w:pPr>
-      <w:r>
-        <w:rPr>
-          <w:rFonts w:hint="eastAsia"/>
-        </w:rPr>
-        <w:t>因此，</w:t>
-      </w:r>
-      <w:r>
-        <w:rPr>
-          <w:rFonts w:hint="eastAsia"/>
-        </w:rPr>
-        <w:t xml:space="preserve">AI </w:t>
-      </w:r>
-      <w:r>
-        <w:rPr>
-          <w:rFonts w:hint="eastAsia"/>
-        </w:rPr>
-        <w:t>在本網站中主要負責「大量閱讀後的候選提取」，而不是直接作出歷史結論。研究者仍然需要檢查原文、確認關係，並決定哪些結果可以加入圖表。這種「</w:t>
-      </w:r>
-      <w:r>
-        <w:rPr>
-          <w:rFonts w:hint="eastAsia"/>
-        </w:rPr>
-        <w:t xml:space="preserve">AI </w:t>
-      </w:r>
-      <w:r>
-        <w:rPr>
-          <w:rFonts w:hint="eastAsia"/>
-        </w:rPr>
-        <w:t>提出候選、研究者確認證據」的流程，是本專案</w:t>
-      </w:r>
-      <w:r>
-        <w:rPr>
-          <w:rFonts w:hint="eastAsia"/>
-        </w:rPr>
-        <w:t xml:space="preserve"> AI </w:t>
-      </w:r>
-      <w:r>
-        <w:rPr>
-          <w:rFonts w:hint="eastAsia"/>
-        </w:rPr>
-        <w:t>審閱迴圈的核心設計。（本專案〈官文優先</w:t>
-      </w:r>
-      <w:r>
-        <w:rPr>
-          <w:rFonts w:hint="eastAsia"/>
-        </w:rPr>
-        <w:t xml:space="preserve"> AI </w:t>
-      </w:r>
-      <w:r>
-        <w:rPr>
-          <w:rFonts w:hint="eastAsia"/>
-        </w:rPr>
-        <w:t>審閱迴圈〉工作規格，</w:t>
-      </w:r>
-      <w:r>
-        <w:rPr>
-          <w:rFonts w:hint="eastAsia"/>
-        </w:rPr>
-        <w:t>2026</w:t>
-      </w:r>
-      <w:r>
-        <w:rPr>
-          <w:rFonts w:hint="eastAsia"/>
-        </w:rPr>
-        <w:t>年，頁碼不適用；本專案〈</w:t>
-      </w:r>
-      <w:r>
-        <w:rPr>
-          <w:rFonts w:hint="eastAsia"/>
-        </w:rPr>
-        <w:t>Project overview</w:t>
-      </w:r>
-      <w:r>
-        <w:rPr>
-          <w:rFonts w:hint="eastAsia"/>
-        </w:rPr>
-        <w:t>〉工作說明，</w:t>
-      </w:r>
-      <w:r>
-        <w:rPr>
-          <w:rFonts w:hint="eastAsia"/>
-        </w:rPr>
-        <w:t>2026</w:t>
-      </w:r>
-      <w:r>
-        <w:rPr>
-          <w:rFonts w:hint="eastAsia"/>
-        </w:rPr>
-        <w:t>年，頁碼不適用。）</w:t>
       </w:r>
     </w:p>
     <w:p/>

</xml_diff>